<commit_message>
Add STACKIT/GCP-interim broker (ez-dadd-2026-STACKIT-gke-gcp-europe-west1-b)
All 3 cloud-broker Solace Cloud services are now created (AWS, Azure,
STACKIT/GCP-interim). Update PLAN.md progress/fasering tables, cloud-brokers
docs with concrete facts (service ID, region code gke-gcp-europe-west1-b,
VPN name truncation+lowercasing), the interim README's status table, and
local-broker/.env.example with the real STACKIT_* connection values.
</commit_message>
<xml_diff>
--- a/docs/Plan-van-aanpak-DADD2026-Enewable.docx
+++ b/docs/Plan-van-aanpak-DADD2026-Enewable.docx
@@ -60,7 +60,7 @@
           <w:sz w:val="20"/>
           <w:szCs w:val="20"/>
         </w:rPr>
-        <w:t xml:space="preserve">Voortgang: Solace Cloud account + API-token gereed; AWS US East (ez-dadd-2026-eks-us-east-1a) en Azure West Europe (ez-dadd-2026-aks-westeurope) zijn aangemaakt. STACKIT/GCP-interim volgt.</w:t>
+        <w:t xml:space="preserve">Voortgang: alle 3 cloud-broker services zijn aangemaakt -- AWS US East (ez-dadd-2026-eks-us-east-1a), Azure West Europe (ez-dadd-2026-aks-westeurope) en de STACKIT/GCP-interim-stand-in (ez-dadd-2026-STACKIT-gke-gcp-europe-west1-b). Volgende stap: lokale broker + bridges opzetten.</w:t>
       </w:r>
     </w:p>
     <w:p>
@@ -560,7 +560,7 @@
                 <w:b w:val="false"/>
                 <w:bCs w:val="false"/>
               </w:rPr>
-              <w:t xml:space="preserve">Sovereign HA (GA verwacht; interim: GCP)</w:t>
+              <w:t xml:space="preserve">Sovereign HA (GA verwacht; interim gereed: GCP europe-west1)</w:t>
             </w:r>
           </w:p>
         </w:tc>
@@ -1311,7 +1311,7 @@
                 <w:b w:val="false"/>
                 <w:bCs w:val="false"/>
               </w:rPr>
-              <w:t xml:space="preserve">Interim-broker op GCP europe-west1 aanmaken; vóór repetitie/DADD checken of STACKIT al GA is</w:t>
+              <w:t xml:space="preserve">✅ Interim-broker op GCP europe-west1 aangemaakt; vóór repetitie/DADD checken of STACKIT al GA is</w:t>
             </w:r>
           </w:p>
         </w:tc>
@@ -1332,7 +1332,7 @@
                 <w:b w:val="false"/>
                 <w:bCs w:val="false"/>
               </w:rPr>
-              <w:t xml:space="preserve">Interim: direct</w:t>
+              <w:t xml:space="preserve">Interim: gereed</w:t>
             </w:r>
           </w:p>
         </w:tc>
@@ -1394,7 +1394,7 @@
                 <w:b w:val="false"/>
                 <w:bCs w:val="false"/>
               </w:rPr>
-              <w:t xml:space="preserve">Account + API-token aanmaken</w:t>
+              <w:t xml:space="preserve">✅ Account + API-token aangemaakt</w:t>
             </w:r>
           </w:p>
         </w:tc>
@@ -1414,7 +1414,7 @@
                 <w:b w:val="false"/>
                 <w:bCs w:val="false"/>
               </w:rPr>
-              <w:t xml:space="preserve">Week na fase 0</w:t>
+              <w:t xml:space="preserve">Gereed</w:t>
             </w:r>
           </w:p>
         </w:tc>
@@ -1476,7 +1476,7 @@
                 <w:b w:val="false"/>
                 <w:bCs w:val="false"/>
               </w:rPr>
-              <w:t xml:space="preserve">AWS + Azure (console/script); sovereign-node = STACKIT als GA, anders GCP interim</w:t>
+              <w:t xml:space="preserve">✅ Alle 3 gereed: AWS, Azure, STACKIT/GCP-interim</w:t>
             </w:r>
           </w:p>
         </w:tc>
@@ -1496,7 +1496,7 @@
                 <w:b w:val="false"/>
                 <w:bCs w:val="false"/>
               </w:rPr>
-              <w:t xml:space="preserve">Ruim vóór fase 5</w:t>
+              <w:t xml:space="preserve">Gereed</w:t>
             </w:r>
           </w:p>
         </w:tc>

</xml_diff>

<commit_message>
Local broker running: mark fase 4 in progress
docker-run.sh executed successfully; container enewable-local-broker is up
(SEMP :8080, SMF :55554). Update PLAN.md progress/fasering tables and
docs/lokale-broker.md with the confirmed endpoints. Next: run
configure-local-broker.sh.
</commit_message>
<xml_diff>
--- a/docs/Plan-van-aanpak-DADD2026-Enewable.docx
+++ b/docs/Plan-van-aanpak-DADD2026-Enewable.docx
@@ -60,7 +60,7 @@
           <w:sz w:val="20"/>
           <w:szCs w:val="20"/>
         </w:rPr>
-        <w:t xml:space="preserve">Voortgang: alle 3 cloud-broker services zijn aangemaakt -- AWS US East (ez-dadd-2026-eks-us-east-1a), Azure West Europe (ez-dadd-2026-aks-westeurope) en de STACKIT/GCP-interim-stand-in (ez-dadd-2026-STACKIT-gke-gcp-europe-west1-b). Volgende stap: lokale broker + bridges opzetten.</w:t>
+        <w:t xml:space="preserve">Voortgang: alle 3 cloud-broker services zijn aangemaakt -- AWS US East (ez-dadd-2026-eks-us-east-1a), Azure West Europe (ez-dadd-2026-aks-westeurope) en de STACKIT/GCP-interim-stand-in (ez-dadd-2026-STACKIT-gke-gcp-europe-west1-b). De lokale broker (enewable-local-broker) draait. Volgende stap: bridges configureren.</w:t>
       </w:r>
     </w:p>
     <w:p>
@@ -304,7 +304,7 @@
                 <w:b w:val="false"/>
                 <w:bCs w:val="false"/>
               </w:rPr>
-              <w:t xml:space="preserve">Self-managed software, single-AZ, Docker</w:t>
+              <w:t xml:space="preserve">Self-managed software, single-AZ, Docker (draait: enewable-local-broker)</w:t>
             </w:r>
           </w:p>
         </w:tc>
@@ -1558,7 +1558,7 @@
                 <w:b w:val="false"/>
                 <w:bCs w:val="false"/>
               </w:rPr>
-              <w:t xml:space="preserve">docker-run.sh + configure-local-broker.sh testen</w:t>
+              <w:t xml:space="preserve">✅ docker-run.sh (broker draait); configure-local-broker.sh nog te doen</w:t>
             </w:r>
           </w:p>
         </w:tc>
@@ -1578,7 +1578,7 @@
                 <w:b w:val="false"/>
                 <w:bCs w:val="false"/>
               </w:rPr>
-              <w:t xml:space="preserve">Na fase 3, herhaald oefenen</w:t>
+              <w:t xml:space="preserve">Bezig</w:t>
             </w:r>
           </w:p>
         </w:tc>

</xml_diff>

<commit_message>
Add configure-remote-bridge-users.sh; fix bash-unsafe .env placeholders
New script creates the enewable-local-bridge client-username + a
publish-only ACL profile on each of the 3 cloud brokers via that broker's
own SEMP v2 Config API -- distinct from the Mission Control API used by
create-service.sh (different endpoint, different credentials, documented
in docs/cloud-brokers.md). Generated a per-broker bridge password.

Verified (not assumed) that network access from both execution
environments to api.solace.cloud and to the brokers' own SEMP hosts is
blocked by an organizational proxy allowlist, so this script -- like
create-service.sh -- must be run by Emil himself.

Also fixed a latent bug: <...>-style placeholders in local-broker/.env(.example)
and cloud-setup/solace-cloud-api/.env.example break when the shell scripts
`source` these files (bash reads "<" as input redirection). Replaced with
bash-safe CHANGEME_... placeholders everywhere.
</commit_message>
<xml_diff>
--- a/docs/Plan-van-aanpak-DADD2026-Enewable.docx
+++ b/docs/Plan-van-aanpak-DADD2026-Enewable.docx
@@ -60,7 +60,7 @@
           <w:sz w:val="20"/>
           <w:szCs w:val="20"/>
         </w:rPr>
-        <w:t xml:space="preserve">Voortgang: alle 3 cloud-broker services zijn aangemaakt -- AWS US East (ez-dadd-2026-eks-us-east-1a), Azure West Europe (ez-dadd-2026-aks-westeurope) en de STACKIT/GCP-interim-stand-in (ez-dadd-2026-STACKIT-gke-gcp-europe-west1-b). De lokale broker (enewable-local-broker) draait. Volgende stap: bridges configureren.</w:t>
+        <w:t xml:space="preserve">Voortgang: alle 3 cloud-broker services zijn aangemaakt en de lokale broker (enewable-local-broker) draait. Bridge-username enewable-local-bridge en wachtwoorden zijn voorbereid; het SEMP-configuratiescript voor de 3 cloud-brokers moet door Emil zelf gedraaid worden (Solace Cloud is vanuit deze sessie niet bereikbaar -- geverifieerd, niet aangenomen).</w:t>
       </w:r>
     </w:p>
     <w:p>
@@ -1558,7 +1558,7 @@
                 <w:b w:val="false"/>
                 <w:bCs w:val="false"/>
               </w:rPr>
-              <w:t xml:space="preserve">✅ docker-run.sh (broker draait); configure-local-broker.sh nog te doen</w:t>
+              <w:t xml:space="preserve">✅ Broker draait; 🔄 bridge-usernames aanmaken (script klaar, door Emil te draaien), dan configure-local-broker.sh</w:t>
             </w:r>
           </w:p>
         </w:tc>

</xml_diff>

<commit_message>
Fix scheme-doubling bug in configure-remote-bridge-users.sh
Emil's first real run failed with "curl: Could not resolve host: https":
the script always prepended https:// to *_SEMP_HOST, but the value he
filled in (matching what the Connect tab shows) already included it,
producing https://https://.... Strip any existing http(s):// prefix before
rebuilding the URL, so the host is accepted with or without a scheme.

Also document the confirmed SEMP admin username (mission-control-manager,
per-service password) now that Emil has filled in real values.
</commit_message>
<xml_diff>
--- a/docs/Plan-van-aanpak-DADD2026-Enewable.docx
+++ b/docs/Plan-van-aanpak-DADD2026-Enewable.docx
@@ -60,7 +60,7 @@
           <w:sz w:val="20"/>
           <w:szCs w:val="20"/>
         </w:rPr>
-        <w:t xml:space="preserve">Voortgang: alle 3 cloud-broker services zijn aangemaakt en de lokale broker (enewable-local-broker) draait. Bridge-username enewable-local-bridge en wachtwoorden zijn voorbereid; het SEMP-configuratiescript voor de 3 cloud-brokers moet door Emil zelf gedraaid worden (Solace Cloud is vanuit deze sessie niet bereikbaar -- geverifieerd, niet aangenomen).</w:t>
+        <w:t xml:space="preserve">Voortgang: alle 3 cloud-broker services zijn aangemaakt en de lokale broker (enewable-local-broker) draait. local-broker/.env is ingevuld met SEMP-admin-credentials (username mission-control-manager, bevestigd). Een scheme-verdubbelingsbug in configure-remote-bridge-users.sh is gevonden en gefixt na de eerste testrun; Emil draait het script opnieuw.</w:t>
       </w:r>
     </w:p>
     <w:p>
@@ -1558,7 +1558,7 @@
                 <w:b w:val="false"/>
                 <w:bCs w:val="false"/>
               </w:rPr>
-              <w:t xml:space="preserve">✅ Broker draait; 🔄 bridge-usernames aanmaken (script klaar, door Emil te draaien), dan configure-local-broker.sh</w:t>
+              <w:t xml:space="preserve">✅ Broker draait; 🔄 bridge-usernames aanmaken (script gefixt na 1e testrun, opnieuw te draaien), dan configure-local-broker.sh</w:t>
             </w:r>
           </w:p>
         </w:tc>

</xml_diff>

<commit_message>
Bridge client-usernames confirmed created on all 3 cloud brokers
configure-remote-bridge-users.sh ran successfully end-to-end after the
scheme fix: enewable-local-bridge + a publish-only ACL profile now exist on
AWS, Azure and STACKIT/GCP-interim. Mark this done in PLAN.md and all three
cloud-setup READMEs. Next: configure-local-broker.sh.
</commit_message>
<xml_diff>
--- a/docs/Plan-van-aanpak-DADD2026-Enewable.docx
+++ b/docs/Plan-van-aanpak-DADD2026-Enewable.docx
@@ -60,7 +60,7 @@
           <w:sz w:val="20"/>
           <w:szCs w:val="20"/>
         </w:rPr>
-        <w:t xml:space="preserve">Voortgang: alle 3 cloud-broker services zijn aangemaakt en de lokale broker (enewable-local-broker) draait. local-broker/.env is ingevuld met SEMP-admin-credentials (username mission-control-manager, bevestigd). Een scheme-verdubbelingsbug in configure-remote-bridge-users.sh is gevonden en gefixt na de eerste testrun; Emil draait het script opnieuw.</w:t>
+        <w:t xml:space="preserve">Voortgang: alle 3 cloud-broker services draaien en enewable-local-bridge (met publish-only ACL) is succesvol aangemaakt op alle 3 via configure-remote-bridge-users.sh. De lokale broker draait. Volgende stap: configure-local-broker.sh (lokale VPN, publisher-ACL's en de 3 bridges).</w:t>
       </w:r>
     </w:p>
     <w:p>
@@ -1558,7 +1558,7 @@
                 <w:b w:val="false"/>
                 <w:bCs w:val="false"/>
               </w:rPr>
-              <w:t xml:space="preserve">✅ Broker draait; 🔄 bridge-usernames aanmaken (script gefixt na 1e testrun, opnieuw te draaien), dan configure-local-broker.sh</w:t>
+              <w:t xml:space="preserve">✅ Broker draait; ✅ bridge-usernames + ACL's aangemaakt op de 3 cloud-brokers; 🔄 configure-local-broker.sh nog te draaien</w:t>
             </w:r>
           </w:p>
         </w:tc>

</xml_diff>

<commit_message>
Fix 2 bugs in configure-local-broker.sh found on Emil's first real run
1. declare -A (bash associative arrays) doesn't work on macOS' system bash
   (/bin/bash there is bash 3.2, frozen since El Capitan for licensing
   reasons; -A needs bash 4). Without -A, [pub-public]=... was parsed as an
   indexed-array subscript and evaluated arithmetically, failing hard under
   set -u ("pub: unbound variable"). Rewritten without associative arrays,
   unrolled into 3 explicit create_scoped_publisher() calls, matching the
   existing create_bridge() style.
2. serviceRestIncomingPlainTextEnabled on the VPN PATCH returned SEMP error
   89 ("A listen port must be configured first"). REST isn't used by any of
   the 3 demo apps (stm: web-messaging, Python/SDKPerf: SMF) -- removed
   rather than wiring up an unused listen port.
</commit_message>
<xml_diff>
--- a/docs/Plan-van-aanpak-DADD2026-Enewable.docx
+++ b/docs/Plan-van-aanpak-DADD2026-Enewable.docx
@@ -60,7 +60,7 @@
           <w:sz w:val="20"/>
           <w:szCs w:val="20"/>
         </w:rPr>
-        <w:t xml:space="preserve">Voortgang: alle 3 cloud-broker services draaien en enewable-local-bridge (met publish-only ACL) is succesvol aangemaakt op alle 3 via configure-remote-bridge-users.sh. De lokale broker draait. Volgende stap: configure-local-broker.sh (lokale VPN, publisher-ACL's en de 3 bridges).</w:t>
+        <w:t xml:space="preserve">Voortgang: cloud-brokers en bridge-users staan; de lokale broker draait. configure-local-broker.sh faalde bij de eerste run op 2 bugs (macOS-bash 3.2 compatibiliteit, REST-listen-port) -- beide gefixt. Emil draait het script opnieuw.</w:t>
       </w:r>
     </w:p>
     <w:p>
@@ -1558,7 +1558,7 @@
                 <w:b w:val="false"/>
                 <w:bCs w:val="false"/>
               </w:rPr>
-              <w:t xml:space="preserve">✅ Broker draait; ✅ bridge-usernames + ACL's aangemaakt op de 3 cloud-brokers; 🔄 configure-local-broker.sh nog te draaien</w:t>
+              <w:t xml:space="preserve">✅ Broker + bridge-users gereed; configure-local-broker.sh 2 bugs gefixt; 🔄 opnieuw te draaien</w:t>
             </w:r>
           </w:p>
         </w:tc>

</xml_diff>

<commit_message>
Fix missing bridgeVirtualRouter attribute; broaden already-exists detection
Bridge creation failed with SEMP error 228 ("Expecting value for required
attribute bridgeVirtualRouter") on broker 10.25.0.208. Added
bridgeVirtualRouter: "auto", correct for this single-node, non-redundant
local broker. Also broadened the "already exists" skip in semp() to match
status ALREADY_EXISTS (not just code 6001), since re-running the script
against the already-created enewable VPN surfaced that variant too.
</commit_message>
<xml_diff>
--- a/docs/Plan-van-aanpak-DADD2026-Enewable.docx
+++ b/docs/Plan-van-aanpak-DADD2026-Enewable.docx
@@ -60,7 +60,7 @@
           <w:sz w:val="20"/>
           <w:szCs w:val="20"/>
         </w:rPr>
-        <w:t xml:space="preserve">Voortgang: cloud-brokers en bridge-users staan; de lokale broker draait. configure-local-broker.sh faalde bij de eerste run op 2 bugs (macOS-bash 3.2 compatibiliteit, REST-listen-port) -- beide gefixt. Emil draait het script opnieuw.</w:t>
+        <w:t xml:space="preserve">Voortgang: lokale VPN, publisher-ACL's en cloud-bridge-users staan. De bridge-aanmaak zelf faalde op een ontbrekend verplicht SEMP-veld (bridgeVirtualRouter) -- de 3e bug die deze iteratieve aanpak heeft blootgelegd, inmiddels gefixt. Emil draait het script opnieuw voor de laatste stap: de 3 bridges.</w:t>
       </w:r>
     </w:p>
     <w:p>
@@ -1558,7 +1558,7 @@
                 <w:b w:val="false"/>
                 <w:bCs w:val="false"/>
               </w:rPr>
-              <w:t xml:space="preserve">✅ Broker + bridge-users gereed; configure-local-broker.sh 2 bugs gefixt; 🔄 opnieuw te draaien</w:t>
+              <w:t xml:space="preserve">✅ VPN + publisher-ACL's gereed; configure-local-broker.sh 3 bugs gefixt; 🔄 opnieuw te draaien voor de bridges</w:t>
             </w:r>
           </w:p>
         </w:tc>

</xml_diff>

<commit_message>
Fix bridge composite-key addressing (name,bridgeVirtualRouter)
With bridgeVirtualRouter added, the bridge object itself now gets created,
but POST .../bridges/{name}/remoteMsgVpns and .../remoteSubscriptions both
returned 535 INVALID_PATH. A bridge's SEMP identity is the composite key
(bridgeName, bridgeVirtualRouter), so its sub-collections must be addressed
via .../bridges/{name},{bridgeVirtualRouter}/... Fixed by building that
composite path.
</commit_message>
<xml_diff>
--- a/docs/Plan-van-aanpak-DADD2026-Enewable.docx
+++ b/docs/Plan-van-aanpak-DADD2026-Enewable.docx
@@ -60,7 +60,7 @@
           <w:sz w:val="20"/>
           <w:szCs w:val="20"/>
         </w:rPr>
-        <w:t xml:space="preserve">Voortgang: lokale VPN, publisher-ACL's en cloud-bridge-users staan. De bridge-aanmaak zelf faalde op een ontbrekend verplicht SEMP-veld (bridgeVirtualRouter) -- de 3e bug die deze iteratieve aanpak heeft blootgelegd, inmiddels gefixt. Emil draait het script opnieuw voor de laatste stap: de 3 bridges.</w:t>
+        <w:t xml:space="preserve">Voortgang: lokale VPN, publisher-ACL's en 3 bridge-objecten staan. De laatste stap (remoteMsgVpn + remoteSubscription per bridge) faalde op een SEMP-adresseringsdetail: een bridge wordt geidentificeerd door het samengestelde sleutelpaar (naam, bridgeVirtualRouter) -- de 4e bug die deze iteratieve aanpak heeft blootgelegd, inmiddels gefixt. Emil draait het script opnieuw.</w:t>
       </w:r>
     </w:p>
     <w:p>
@@ -1558,7 +1558,7 @@
                 <w:b w:val="false"/>
                 <w:bCs w:val="false"/>
               </w:rPr>
-              <w:t xml:space="preserve">✅ VPN + publisher-ACL's gereed; configure-local-broker.sh 3 bugs gefixt; 🔄 opnieuw te draaien voor de bridges</w:t>
+              <w:t xml:space="preserve">✅ VPN + publisher-ACL's + bridge-objecten gereed; configure-local-broker.sh 4 bugs gefixt; 🔄 opnieuw te draaien</w:t>
             </w:r>
           </w:p>
         </w:tc>

</xml_diff>

<commit_message>
Move bridge remote-auth fields off remoteMsgVpns onto the bridge object
Bridges were created and visible in Broker Manager but all Down with empty
Remote Message VPN/Remote Broker columns, because POST .../remoteMsgVpns
failed with "11 INVALID_PARAMETER: Unknown attribute
'remoteAuthenticationScheme'" every time -- so the remote destination was
never actually configured. remoteAuthenticationScheme/
remoteAuthenticationBasicClientUsername/Password belong on the bridge
object itself (PATCH .../bridges/{name},{vr}), not on the remoteMsgVpns
sub-object. Moved accordingly.
</commit_message>
<xml_diff>
--- a/docs/Plan-van-aanpak-DADD2026-Enewable.docx
+++ b/docs/Plan-van-aanpak-DADD2026-Enewable.docx
@@ -60,7 +60,7 @@
           <w:sz w:val="20"/>
           <w:szCs w:val="20"/>
         </w:rPr>
-        <w:t xml:space="preserve">Voortgang: lokale VPN, publisher-ACL's en 3 bridge-objecten staan. De laatste stap (remoteMsgVpn + remoteSubscription per bridge) faalde op een SEMP-adresseringsdetail: een bridge wordt geidentificeerd door het samengestelde sleutelpaar (naam, bridgeVirtualRouter) -- de 4e bug die deze iteratieve aanpak heeft blootgelegd, inmiddels gefixt. Emil draait het script opnieuw.</w:t>
+        <w:t xml:space="preserve">Voortgang: VPN, ACL's en 3 bridge-objecten staan (bevestigd in Broker Manager), maar alle 3 bridges nog Down. 5e bug gevonden en gefixt: de remote-authenticatievelden horen op het bridge-object zelf, niet op het remoteMsgVpns-sub-object. Emil draait het script opnieuw.</w:t>
       </w:r>
     </w:p>
     <w:p>
@@ -1558,7 +1558,7 @@
                 <w:b w:val="false"/>
                 <w:bCs w:val="false"/>
               </w:rPr>
-              <w:t xml:space="preserve">✅ VPN + publisher-ACL's + bridge-objecten gereed; configure-local-broker.sh 4 bugs gefixt; 🔄 opnieuw te draaien</w:t>
+              <w:t xml:space="preserve">✅ VPN + ACL's + bridge-objecten gereed (nog Down); configure-local-broker.sh 5 bugs gefixt; 🔄 opnieuw te draaien</w:t>
             </w:r>
           </w:p>
         </w:tc>

</xml_diff>

<commit_message>
Add read-only bridge diagnostic script; bridges still Down after clean config run
configure-local-broker.sh now applies with zero WARN lines (VPN, ACL's,
client-usernames, all 3 bridges + remoteMsgVpns + remoteSubscriptions all
succeed). Screenshots confirm each bridge now shows its remote Message VPN
name and via: <ip>:55443, so the SEMP config is reaching the broker
correctly -- yet all 3 bridges remain "Down". This is no longer a
config/schema bug (bugs 1-5 already fixed) but a connection-level issue.

Broker Manager doesn't surface a down-reason, so add
local-broker/semp/diagnose-bridges.sh: a read-only script that queries the
SEMP v2 MONITOR API (not the Config API) for each bridge, which carries the
actual connection-failure detail. Waiting on Emil to run it and share the
output.

Also commit the 3 new localhost screenshots that surfaced this, and update
PLAN.md / docs/lokale-broker.md / the Word summary accordingly.
</commit_message>
<xml_diff>
--- a/docs/Plan-van-aanpak-DADD2026-Enewable.docx
+++ b/docs/Plan-van-aanpak-DADD2026-Enewable.docx
@@ -60,7 +60,7 @@
           <w:sz w:val="20"/>
           <w:szCs w:val="20"/>
         </w:rPr>
-        <w:t xml:space="preserve">Voortgang: VPN, ACL's en 3 bridge-objecten staan (bevestigd in Broker Manager), maar alle 3 bridges nog Down. 5e bug gevonden en gefixt: de remote-authenticatievelden horen op het bridge-object zelf, niet op het remoteMsgVpns-sub-object. Emil draait het script opnieuw.</w:t>
+        <w:t xml:space="preserve">Voortgang: configure-local-broker.sh draait nu volledig schoon (0 WARN, ook remoteMsgVpns slaagt). Toch blijven alle 3 bridges Down -- screenshots bevestigen dat de remote VPN-naam en het adres nu wel getoond worden, dus dit is geen SEMP-configuratiefout meer maar een verbindingsprobleem (netwerk/TLS/credentials). Nieuw diagnosescript (diagnose-bridges.sh, read-only) opgevraagd om de echte down-reden te vinden via de SEMP monitor-API.</w:t>
       </w:r>
     </w:p>
     <w:p>
@@ -1558,7 +1558,7 @@
                 <w:b w:val="false"/>
                 <w:bCs w:val="false"/>
               </w:rPr>
-              <w:t xml:space="preserve">✅ VPN + ACL's + bridge-objecten gereed (nog Down); configure-local-broker.sh 5 bugs gefixt; 🔄 opnieuw te draaien</w:t>
+              <w:t xml:space="preserve">✅ configure-local-broker.sh draait schoon (0 WARN); bridges nog steeds Down -- geen configfout meer maar verbindingsprobleem; 🔄 diagnose-bridges.sh (nieuw) draaien voor down-reden</w:t>
             </w:r>
           </w:p>
         </w:tc>

</xml_diff>

<commit_message>
Fix RDP rest-consumer authenticationScheme value: http-basic, not basic
First real run of configure-rdp-export.sh (Emil, 28/09/2026): the 3
queues, RDP objects and queue-bindings were all created cleanly (0 WARN),
but all 3 restConsumers POSTs failed with SEMP error 11 -- the broker's
own error message gave the real enum for a rest-consumer's
authenticationScheme ('none', 'http-basic', 'client-certificate',
'http-header', 'oauth-client', 'oauth-jwt', 'transparent', 'aws'). "basic"
is the bridge convention (remoteAuthenticationScheme), not the RDP one.
The Go SEMP client used to confirm attribute names in the previous commit
confirmed the field names, not the valid values for this particular enum.

Script is idempotent, so re-running only needs to (re-)create the 3
rest-consumers now.
</commit_message>
<xml_diff>
--- a/docs/Plan-van-aanpak-DADD2026-Enewable.docx
+++ b/docs/Plan-van-aanpak-DADD2026-Enewable.docx
@@ -60,7 +60,7 @@
           <w:sz w:val="20"/>
           <w:szCs w:val="20"/>
         </w:rPr>
-        <w:t xml:space="preserve">Voortgang: bridge-export via remoteSubscription bleek alleen te kunnen importeren, niet exporteren, zonder een wederkerige bridge + publiek bereikbare lokale broker (een poging om dat laatste te vermijden via Solace's virtual-router-name-mechanisme is getest op AWS en bleek negatief). Emil koos daarop een derde, betere optie: de demo-apps blijven ongewijzigd DIRECT publiceren; 3 lokale queues vangen die berichten automatisch op (Solace's "message promotion", geen appwijziging nodig) en 3 REST Delivery Points sturen elke queue native door naar de bijbehorende cloud-broker, op dezelfde topic. Geïmplementeerd, en de oude bridge-configuratie/scripts zijn inmiddels opgeruimd; testrun en validatie door Emil zijn de volgende stap.</w:t>
+        <w:t xml:space="preserve">Voortgang: bridge-export bleek alleen te kunnen importeren, niet exporteren, zonder een publiek bereikbare lokale broker -- Emil koos daarop queues + REST Delivery Points (RDP's): demo-apps blijven ongewijzigd DIRECT publiceren, 3 queues vangen dit automatisch op (Solace "message promotion"), 3 RDP's sturen elke queue native door naar de bijbehorende cloud-broker. Oude bridge-configuratie opgeruimd. Eerste testrun (28/09) maakte queues/RDP's/queue-bindings schoon aan maar faalde op de rest-consumers door een verkeerde authenticationScheme-waarde ("basic" i.p.v. "http-basic") -- gefixt; Emil draait het script nu opnieuw.</w:t>
       </w:r>
     </w:p>
     <w:p>
@@ -1558,7 +1558,7 @@
                 <w:b w:val="false"/>
                 <w:bCs w:val="false"/>
               </w:rPr>
-              <w:t xml:space="preserve">🔧 Aangepaste optie 2 (Emils keuze) geïmplementeerd + oude bridge-configuratie opgeruimd: queues + REST Delivery Points i.p.v. bridges voor export, demo-apps ongewijzigd (message promotion vangt DIRECT-berichten automatisch op). Testrun + validatie door Emil nodig</w:t>
+              <w:t xml:space="preserve">🔧 Eerste testrun vond 1 scriptbug (authenticationScheme-waarde "basic" moest "http-basic" zijn), nu gefixt. Script opnieuw draaien om de 3 rest-consumers alsnog aan te maken</w:t>
             </w:r>
           </w:p>
         </w:tc>
@@ -1578,7 +1578,7 @@
                 <w:b w:val="false"/>
                 <w:bCs w:val="false"/>
               </w:rPr>
-              <w:t xml:space="preserve">Testrun nu</w:t>
+              <w:t xml:space="preserve">Opnieuw draaien nu</w:t>
             </w:r>
           </w:p>
         </w:tc>

</xml_diff>

<commit_message>
Record clean re-run of configure-rdp-export.sh (0 WARN)
The authenticationScheme fix resolved the failure: the 9 pre-existing
objects were correctly skipped, and all 3 REST consumers were created
without error this time. Next: confirm in Broker Manager that the queues
receive messages and the 3 RDPs show "Up".
</commit_message>
<xml_diff>
--- a/docs/Plan-van-aanpak-DADD2026-Enewable.docx
+++ b/docs/Plan-van-aanpak-DADD2026-Enewable.docx
@@ -60,7 +60,7 @@
           <w:sz w:val="20"/>
           <w:szCs w:val="20"/>
         </w:rPr>
-        <w:t xml:space="preserve">Voortgang: bridge-export bleek alleen te kunnen importeren, niet exporteren, zonder een publiek bereikbare lokale broker -- Emil koos daarop queues + REST Delivery Points (RDP's): demo-apps blijven ongewijzigd DIRECT publiceren, 3 queues vangen dit automatisch op (Solace "message promotion"), 3 RDP's sturen elke queue native door naar de bijbehorende cloud-broker. Oude bridge-configuratie opgeruimd. Eerste testrun (28/09) maakte queues/RDP's/queue-bindings schoon aan maar faalde op de rest-consumers door een verkeerde authenticationScheme-waarde ("basic" i.p.v. "http-basic") -- gefixt; Emil draait het script nu opnieuw.</w:t>
+        <w:t xml:space="preserve">Voortgang: bridge-export bleek alleen te kunnen importeren, niet exporteren, zonder een publiek bereikbare lokale broker -- Emil koos daarop queues + REST Delivery Points (RDP's): demo-apps blijven ongewijzigd DIRECT publiceren, 3 queues vangen dit automatisch op (Solace "message promotion"), 3 RDP's sturen elke queue native door naar de bijbehorende cloud-broker. Oude bridge-configuratie opgeruimd. Eerste testrun (28/09) faalde op de rest-consumers door een verkeerde authenticationScheme-waarde ("basic" i.p.v. "http-basic") -- gefixt, en de herhaalde run draait nu volledig schoon (0 WARN). Nog te bevestigen in Broker Manager: queues vullen zich, en de 3 RDP's tonen "Up".</w:t>
       </w:r>
     </w:p>
     <w:p>
@@ -1558,7 +1558,7 @@
                 <w:b w:val="false"/>
                 <w:bCs w:val="false"/>
               </w:rPr>
-              <w:t xml:space="preserve">🔧 Eerste testrun vond 1 scriptbug (authenticationScheme-waarde "basic" moest "http-basic" zijn), nu gefixt. Script opnieuw draaien om de 3 rest-consumers alsnog aan te maken</w:t>
+              <w:t xml:space="preserve">🔧 Script draait volledig schoon (0 WARN) na de authenticationScheme-fix. Broker Manager-check nodig: queues vullen zich, 3 RDP's tonen "Up"</w:t>
             </w:r>
           </w:p>
         </w:tc>
@@ -1578,7 +1578,7 @@
                 <w:b w:val="false"/>
                 <w:bCs w:val="false"/>
               </w:rPr>
-              <w:t xml:space="preserve">Opnieuw draaien nu</w:t>
+              <w:t xml:space="preserve">Verificatie nu</w:t>
             </w:r>
           </w:p>
         </w:tc>

</xml_diff>

<commit_message>
Add diagnose-rdp.sh: all 3 RDPs show Down, need MONITOR-API detail
configure-rdp-export.sh now runs with 0 WARN, and Emil confirmed the
REST host:port assumption (same host as SMF, port 9443) is correct via
the AWS service's own Connect tab -- so that's ruled out. Broker Manager
still shows all 3 RDPs as "Down" and gives no reason, same situation we
hit earlier with the bridges. Added a read-only diagnostic script
(local-broker/semp/diagnose-rdp.sh, analogous to the removed
diagnose-bridges.sh) that dumps the SEMP v2 CONFIG + MONITOR views of
each RDP/rest-consumer/queue to output/diagnose-rdp.txt, so the real
failure reason (credentials, TLS trust, REST not enabled on the cloud
VPN, or something else) can be read instead of guessed.
</commit_message>
<xml_diff>
--- a/docs/Plan-van-aanpak-DADD2026-Enewable.docx
+++ b/docs/Plan-van-aanpak-DADD2026-Enewable.docx
@@ -60,7 +60,7 @@
           <w:sz w:val="20"/>
           <w:szCs w:val="20"/>
         </w:rPr>
-        <w:t xml:space="preserve">Voortgang: bridge-export bleek alleen te kunnen importeren, niet exporteren, zonder een publiek bereikbare lokale broker -- Emil koos daarop queues + REST Delivery Points (RDP's): demo-apps blijven ongewijzigd DIRECT publiceren, 3 queues vangen dit automatisch op (Solace "message promotion"), 3 RDP's sturen elke queue native door naar de bijbehorende cloud-broker. Oude bridge-configuratie opgeruimd. Eerste testrun (28/09) faalde op de rest-consumers door een verkeerde authenticationScheme-waarde ("basic" i.p.v. "http-basic") -- gefixt, en de herhaalde run draait nu volledig schoon (0 WARN). Nog te bevestigen in Broker Manager: queues vullen zich, en de 3 RDP's tonen "Up".</w:t>
+        <w:t xml:space="preserve">Voortgang: bridge-export bleek alleen te kunnen importeren, niet exporteren, zonder een publiek bereikbare lokale broker -- Emil koos daarop queues + REST Delivery Points (RDP's): demo-apps blijven ongewijzigd DIRECT publiceren, 3 queues vangen dit automatisch op (Solace "message promotion"), 3 RDP's sturen elke queue native door naar de bijbehorende cloud-broker. Oude bridge-configuratie opgeruimd. Eerste testrun faalde op de rest-consumers door een verkeerde authenticationScheme-waarde ("basic" i.p.v. "http-basic") -- gefixt, en de herhaalde run draait nu volledig schoon (0 WARN). Broker Manager toont echter alle 3 RDP's als "Down"; het REST-host:poort-vermoeden (9443, zelfde host als SMF) is inmiddels bevestigd correct via de Connect-tab, dus de oorzaak ligt elders. Nieuw diagnostisch script (diagnose-rdp.sh) moet dit blootleggen.</w:t>
       </w:r>
     </w:p>
     <w:p>
@@ -1558,7 +1558,7 @@
                 <w:b w:val="false"/>
                 <w:bCs w:val="false"/>
               </w:rPr>
-              <w:t xml:space="preserve">🔧 Script draait volledig schoon (0 WARN) na de authenticationScheme-fix. Broker Manager-check nodig: queues vullen zich, 3 RDP's tonen "Up"</w:t>
+              <w:t xml:space="preserve">⛔ Script draait schoon (0 WARN), REST-host:poort bevestigd correct via Connect-tab -- toch tonen alle 3 RDP's "Down". Nieuw diagnostisch script diagnose-rdp.sh wacht op Emils run</w:t>
             </w:r>
           </w:p>
         </w:tc>
@@ -1578,7 +1578,7 @@
                 <w:b w:val="false"/>
                 <w:bCs w:val="false"/>
               </w:rPr>
-              <w:t xml:space="preserve">Verificatie nu</w:t>
+              <w:t xml:space="preserve">Diagnose nu</w:t>
             </w:r>
           </w:p>
         </w:tc>

</xml_diff>

<commit_message>
Narrow RDP-down cause to the queue binding, extend diagnose-rdp.sh
diagnose-rdp.txt shows each REST consumer is actually healthy (up: true,
remoteOutgoingConnectionUpCount matches outgoingConnectionCount) -- the
TLS + http-basic connection to every cloud broker works. The
lastConnectionFailureReason/lastFailureReason on the consumers are stale,
timestamped to the earlier run before the authenticationScheme fix.

The real signal is on the RDP object itself: up: false,
lastFailureReason "No REST Queue Bindings Up", identical timestamp
across all 3 RDPs. diagnose-rdp.sh never queried the queue-binding
sub-object itself (only the parent RDP and the queue) -- added GET calls
for restDeliveryPoints/{rdp}/queueBindings/{queue} (config + monitor) and
queues/{queue}/subscriptions, to get the queue-binding's own up/reason
field directly instead of inferring from the queue's (normally empty
until queried) collections placeholder.
</commit_message>
<xml_diff>
--- a/docs/Plan-van-aanpak-DADD2026-Enewable.docx
+++ b/docs/Plan-van-aanpak-DADD2026-Enewable.docx
@@ -60,7 +60,7 @@
           <w:sz w:val="20"/>
           <w:szCs w:val="20"/>
         </w:rPr>
-        <w:t xml:space="preserve">Voortgang: bridge-export bleek alleen te kunnen importeren, niet exporteren, zonder een publiek bereikbare lokale broker -- Emil koos daarop queues + REST Delivery Points (RDP's): demo-apps blijven ongewijzigd DIRECT publiceren, 3 queues vangen dit automatisch op (Solace "message promotion"), 3 RDP's sturen elke queue native door naar de bijbehorende cloud-broker. Oude bridge-configuratie opgeruimd. Eerste testrun faalde op de rest-consumers door een verkeerde authenticationScheme-waarde ("basic" i.p.v. "http-basic") -- gefixt, en de herhaalde run draait nu volledig schoon (0 WARN). Broker Manager toont echter alle 3 RDP's als "Down"; het REST-host:poort-vermoeden (9443, zelfde host als SMF) is inmiddels bevestigd correct via de Connect-tab, dus de oorzaak ligt elders. Nieuw diagnostisch script (diagnose-rdp.sh) moet dit blootleggen.</w:t>
+        <w:t xml:space="preserve">Voortgang: bridge-export bleek alleen te kunnen importeren, niet exporteren, zonder een publiek bereikbare lokale broker -- Emil koos daarop queues + REST Delivery Points (RDP's): demo-apps blijven ongewijzigd DIRECT publiceren, 3 queues vangen dit automatisch op (Solace "message promotion"), 3 RDP's sturen elke queue native door naar de bijbehorende cloud-broker. Oude bridge-configuratie opgeruimd. Eerste testrun faalde op de rest-consumers door een verkeerde authenticationScheme-waarde ("basic" i.p.v. "http-basic") -- gefixt, en de herhaalde run draait nu volledig schoon (0 WARN). Broker Manager toont echter alle 3 RDP's als "Down"; het REST-host:poort-vermoeden is bevestigd correct, dus de oorzaak ligt elders. De diagnose (diagnose-rdp.sh) laat zien dat de REST-consumer zelf gezond is (up:true, 3 verbindingen) -- de RDP faalt specifiek op "No REST Queue Bindings Up", dus de queue-binding is de boosdoener. Script uitgebreid om dat direct te bevestigen; Emil draait het nogmaals.</w:t>
       </w:r>
     </w:p>
     <w:p>
@@ -1558,7 +1558,7 @@
                 <w:b w:val="false"/>
                 <w:bCs w:val="false"/>
               </w:rPr>
-              <w:t xml:space="preserve">⛔ Script draait schoon (0 WARN), REST-host:poort bevestigd correct via Connect-tab -- toch tonen alle 3 RDP's "Down". Nieuw diagnostisch script diagnose-rdp.sh wacht op Emils run</w:t>
+              <w:t xml:space="preserve">🔬 De REST-consumer zelf is gezond (up:true); de RDP faalt op "No REST Queue Bindings Up" -- de queue-binding, niet de verbinding, is de boosdoener. diagnose-rdp.sh uitgebreid, opnieuw draaien nodig</w:t>
             </w:r>
           </w:p>
         </w:tc>
@@ -1578,7 +1578,7 @@
                 <w:b w:val="false"/>
                 <w:bCs w:val="false"/>
               </w:rPr>
-              <w:t xml:space="preserve">Diagnose nu</w:t>
+              <w:t xml:space="preserve">Diagnose nu (ronde 2)</w:t>
             </w:r>
           </w:p>
         </w:tc>

</xml_diff>

<commit_message>
Narrow RDP down-cause to 503 on queue-binding, add REST-incoming enable script
diagnose-rdp.sh (round 2) showed each queue-binding failing with
lastFailureReason "Service Unavailable" (HTTP 503), while the
REST-consumer's underlying TLS+http-basic connection is healthy (up:true)
and each queue's topic subscription is confirmed present. Adds
cloud-setup/solace-cloud-api/enable-rest-on-cloud-vpns.sh to check/enable
serviceRestIncomingTlsEnabled on each cloud VPN via its own SEMP v2 Config
API -- the leading (unconfirmed) theory for the 503. Updates PLAN.md
(section 13 item 16, progress/fasering tables, vervolgstappen step 4) and
docs/lokale-broker.md, and rebuilds the plan-van-aanpak docx to match.

Co-Authored-By: Claude Sonnet 5 <noreply@anthropic.com>
Claude-Session: https://claude.ai/code/session_01LyLzg69DjEjtAeYz9FrHW3
</commit_message>
<xml_diff>
--- a/docs/Plan-van-aanpak-DADD2026-Enewable.docx
+++ b/docs/Plan-van-aanpak-DADD2026-Enewable.docx
@@ -60,7 +60,7 @@
           <w:sz w:val="20"/>
           <w:szCs w:val="20"/>
         </w:rPr>
-        <w:t xml:space="preserve">Voortgang: bridge-export bleek alleen te kunnen importeren, niet exporteren, zonder een publiek bereikbare lokale broker -- Emil koos daarop queues + REST Delivery Points (RDP's): demo-apps blijven ongewijzigd DIRECT publiceren, 3 queues vangen dit automatisch op (Solace "message promotion"), 3 RDP's sturen elke queue native door naar de bijbehorende cloud-broker. Oude bridge-configuratie opgeruimd. Eerste testrun faalde op de rest-consumers door een verkeerde authenticationScheme-waarde ("basic" i.p.v. "http-basic") -- gefixt, en de herhaalde run draait nu volledig schoon (0 WARN). Broker Manager toont echter alle 3 RDP's als "Down"; het REST-host:poort-vermoeden is bevestigd correct, dus de oorzaak ligt elders. De diagnose (diagnose-rdp.sh) laat zien dat de REST-consumer zelf gezond is (up:true, 3 verbindingen) -- de RDP faalt specifiek op "No REST Queue Bindings Up", dus de queue-binding is de boosdoener. Script uitgebreid om dat direct te bevestigen; Emil draait het nogmaals.</w:t>
+        <w:t xml:space="preserve">Voortgang: bridge-export bleek alleen te kunnen importeren, niet exporteren, zonder een publiek bereikbare lokale broker -- Emil koos daarop queues + REST Delivery Points (RDP's): demo-apps blijven ongewijzigd DIRECT publiceren, 3 queues vangen dit automatisch op (Solace "message promotion"), 3 RDP's sturen elke queue native door naar de bijbehorende cloud-broker. Oude bridge-configuratie opgeruimd. Eerste testrun faalde op de rest-consumers door een verkeerde authenticationScheme-waarde ("basic" i.p.v. "http-basic") -- gefixt, en de herhaalde run draait nu volledig schoon (0 WARN). Broker Manager toont echter alle 3 RDP's als "Down". De diagnose (diagnose-rdp.sh) heeft de oorzaak inmiddels vernauwd: de REST-consumer-verbinding zelf is gezond (up:true) en de topic-subscriptie op elke queue is bevestigd aanwezig -- maar de queue-binding faalt met HTTP 503 "Service Unavailable": de verbinding komt tot stand, de POST wordt afgewezen. Vermoedelijke oorzaak: REST-incoming staat niet aan op de doel-Message-VPN. Nieuw script enable-rest-on-cloud-vpns.sh checkt/zet dit aan; Emil draait het en herhaalt daarna diagnose-rdp.sh.</w:t>
       </w:r>
     </w:p>
     <w:p>
@@ -1558,7 +1558,7 @@
                 <w:b w:val="false"/>
                 <w:bCs w:val="false"/>
               </w:rPr>
-              <w:t xml:space="preserve">🔬 De REST-consumer zelf is gezond (up:true); de RDP faalt op "No REST Queue Bindings Up" -- de queue-binding, niet de verbinding, is de boosdoener. diagnose-rdp.sh uitgebreid, opnieuw draaien nodig</w:t>
+              <w:t xml:space="preserve">🔬 Queue-binding faalt met HTTP 503 "Service Unavailable"; REST-consumer-verbinding en topic-subscriptie zijn beide bevestigd gezond. Vermoedelijke oorzaak: REST-incoming staat niet aan op de cloud-VPN -- nieuw script enable-rest-on-cloud-vpns.sh toegevoegd</w:t>
             </w:r>
           </w:p>
         </w:tc>
@@ -1578,7 +1578,7 @@
                 <w:b w:val="false"/>
                 <w:bCs w:val="false"/>
               </w:rPr>
-              <w:t xml:space="preserve">Diagnose nu (ronde 2)</w:t>
+              <w:t xml:space="preserve">Emil draait het script, dan diagnose-rdp.sh opnieuw</w:t>
             </w:r>
           </w:p>
         </w:tc>
@@ -1905,7 +1905,7 @@
         <w:spacing w:after="80"/>
       </w:pPr>
       <w:r>
-        <w:t xml:space="preserve">De RDP-attribuutnamen zijn gecrosscheckt tegen een werkende Go SEMP-client (Solace's eigen CLI-documentatie geeft geen REST-attribuutnamen), maar het REST-host/poort per cloud-service (aanname: 9443) moet Emil nog bevestigen op de Connect-tab -- eerste concrete vervolgstap.</w:t>
+        <w:t xml:space="preserve">De RDP-attribuutnamen zijn gecrosscheckt tegen een werkende Go SEMP-client (Solace's eigen CLI-documentatie geeft geen REST-attribuutnamen); het REST-host/poort per cloud-service (9443) is inmiddels bevestigd correct via de Connect-tab. De resterende "Down"-status is vernauwd tot een HTTP 503 op de queue-binding, met als vermoedelijke oorzaak dat REST-incoming niet aanstaat op de cloud-VPN.</w:t>
       </w:r>
     </w:p>
     <w:p>
@@ -1953,7 +1953,7 @@
         <w:spacing w:after="80"/>
       </w:pPr>
       <w:r>
-        <w:t xml:space="preserve">REST-host/poort per cloud-service bevestigen op de Connect-tab (en REST-messaging aanzetten waar nog uit) en configure-rdp-export.sh draaien.</w:t>
+        <w:t xml:space="preserve">enable-rest-on-cloud-vpns.sh draaien om REST-incoming te checken/aan te zetten op elke cloud-VPN, daarna diagnose-rdp.sh herhalen.</w:t>
       </w:r>
     </w:p>
     <w:p>
@@ -1966,7 +1966,7 @@
         <w:spacing w:after="80"/>
       </w:pPr>
       <w:r>
-        <w:t xml:space="preserve">Controleren dat de 3 queues gevuld raken en de 3 REST Delivery Points "Up" komen in Broker Manager.</w:t>
+        <w:t xml:space="preserve">Controleren dat de queue-binding's lastFailureReason verandert (niet meer "Service Unavailable") en dat de 3 REST Delivery Points "Up" komen in Broker Manager.</w:t>
       </w:r>
     </w:p>
     <w:p>

</xml_diff>

<commit_message>
Fix watch-rdp-live.sh: jq filter read from wrong JSON level
First run of watch-rdp-live.sh (Emil, 28/09/2026) returned null for every
consumer/binding field across all 15 samples -- not new broker info, a bug
in the script itself. The jq filter read {up, uptime, ...} straight off
the SEMP response's top-level object, but SEMP v2 wraps everything under
a "data" key, so those field names never existed at the level being
filtered. The queue line worked correctly (it already filtered on .data),
confirming q-export-public now holds 30 spooled messages.

Fixed the filter to '.data | {up, uptime, ...}'. Since messages are
already sitting in the queue across many retry cycles, no fresh
publish-test is needed before re-running -- just watch-rdp-live.sh again.

Updates PLAN.md (section 13 item 25, section 14 step 4) and rebuilds the
docx summary accordingly.

Co-Authored-By: Claude Sonnet 5 <noreply@anthropic.com>
Claude-Session: https://claude.ai/code/session_01LyLzg69DjEjtAeYz9FrHW3
</commit_message>
<xml_diff>
--- a/docs/Plan-van-aanpak-DADD2026-Enewable.docx
+++ b/docs/Plan-van-aanpak-DADD2026-Enewable.docx
@@ -60,7 +60,7 @@
           <w:sz w:val="20"/>
           <w:szCs w:val="20"/>
         </w:rPr>
-        <w:t xml:space="preserve">Voortgang: bridge-export bleek alleen te kunnen importeren, niet exporteren, zonder een publiek bereikbare lokale broker -- Emil koos daarop queues + REST Delivery Points (RDP's): demo-apps blijven ongewijzigd DIRECT publiceren, 3 queues vangen dit automatisch op (Solace "message promotion"), 3 RDP's sturen elke queue native door naar de bijbehorende cloud-broker. Oude bridge-configuratie opgeruimd. Eerste testrun faalde op de rest-consumers door een verkeerde authenticationScheme-waarde ("basic" i.p.v. "http-basic") -- gefixt, en de herhaalde run draait nu volledig schoon (0 WARN). Broker Manager toont echter alle 3 RDP's als "Down" met HTTP 503 "Service Unavailable" op de queue-binding. Een directe curl-POST naar alle 3 cloud-brokers, met dezelfde host/poort/credentials/topic-constructie als de RDP gebruikt, lukt gewoon (200 OK) -- dit sluit REST-incoming-uitgeschakeld, verkeerde auth, host/poort en topic-mapping definitief uit; de REST-consumer se eigen tellers staan nog op 0 (nog nooit een échte berichtaflevering geprobeerd). De eerste poging tot een echte end-to-end publish-test liep meteen vast op de demo-app zelf: de geïnstalleerde Solace Try-Me CLI (stm v1.0.0) kent geen "publish"-subcommando, alleen "send" -- gefixt in publish-public.sh. Na die fix loopt de test alweer vast, nu op een nieuw en apart probleem: de lokale broker wijst pub-public af met "The RADIUS profile is shutdown" -- dit gebeurt vóórdat de RDP-keten zelfs bereikt wordt, dus los van het 503-onderzoek. Bevestigd en gefixt: de enewable-VPN se auth-type stond daadwerkelijk op "radius" zonder enig RADIUS-profiel; configure-local-broker.sh PATCHt de VPN nu naar "internal". Na die fix lukte de verbinding, maar elk bericht werd geweigerd ("Sending guaranteed message is not allowed by router for this client"): stm send publiceert standaard PERSISTENT, niet DIRECT. Ook gefixt: --delivery-mode DIRECT toegevoegd. Daarna landde het bericht eindelijk in de lokale queue (message-promotion bevestigd werkend, spooledMsgCount: 10), maar kwam niet aan op AWS. Root cause gevonden: requestTargetEvaluation op de queue-binding stond op "none", dus "${topic()}" werd nooit geëvalueerd -- elke queue-binding postte naar het letterlijke pad "/${topic()}", vermoedelijk geblokkeerd door een WAF (Log4Shell-achtig patroon). Gefixt in configure-rdp-export.sh. Vervolg: een herhaalde diagnose (ronde 5, spooledMsgCount inmiddels 20) bevestigt dat de fix daadwerkelijk live staat, maar de 503 en httpRequestTxMsgCount: 0 blijven volledig ongewijzigd -- dus niet de (enige) oorzaak. Nieuw spoor: de REST-consumer toont "lastConnectionFailureReason": "Peer TCP Closed" -- mogelijk sluit de cloud-broker de persistente verbindingspool van de RDP actief, terwijl een losse curl-POST (nieuwe verbinding per keer) altijd wél slaagt. Nieuw diagnosescript watch-rdp-live.sh moet dit bevestigen of ontkrachten.</w:t>
+        <w:t xml:space="preserve">Voortgang: bridge-export bleek alleen te kunnen importeren, niet exporteren, zonder een publiek bereikbare lokale broker -- Emil koos daarop queues + REST Delivery Points (RDP's): demo-apps blijven ongewijzigd DIRECT publiceren, 3 queues vangen dit automatisch op (Solace "message promotion"), 3 RDP's sturen elke queue native door naar de bijbehorende cloud-broker. Oude bridge-configuratie opgeruimd. Eerste testrun faalde op de rest-consumers door een verkeerde authenticationScheme-waarde ("basic" i.p.v. "http-basic") -- gefixt, en de herhaalde run draait nu volledig schoon (0 WARN). Broker Manager toont echter alle 3 RDP's als "Down" met HTTP 503 "Service Unavailable" op de queue-binding. Een directe curl-POST naar alle 3 cloud-brokers, met dezelfde host/poort/credentials/topic-constructie als de RDP gebruikt, lukt gewoon (200 OK) -- dit sluit REST-incoming-uitgeschakeld, verkeerde auth, host/poort en topic-mapping definitief uit; de REST-consumer se eigen tellers staan nog op 0 (nog nooit een échte berichtaflevering geprobeerd). De eerste poging tot een echte end-to-end publish-test liep meteen vast op de demo-app zelf: de geïnstalleerde Solace Try-Me CLI (stm v1.0.0) kent geen "publish"-subcommando, alleen "send" -- gefixt in publish-public.sh. Na die fix loopt de test alweer vast, nu op een nieuw en apart probleem: de lokale broker wijst pub-public af met "The RADIUS profile is shutdown" -- dit gebeurt vóórdat de RDP-keten zelfs bereikt wordt, dus los van het 503-onderzoek. Bevestigd en gefixt: de enewable-VPN se auth-type stond daadwerkelijk op "radius" zonder enig RADIUS-profiel; configure-local-broker.sh PATCHt de VPN nu naar "internal". Na die fix lukte de verbinding, maar elk bericht werd geweigerd ("Sending guaranteed message is not allowed by router for this client"): stm send publiceert standaard PERSISTENT, niet DIRECT. Ook gefixt: --delivery-mode DIRECT toegevoegd. Daarna landde het bericht eindelijk in de lokale queue (message-promotion bevestigd werkend, spooledMsgCount: 10), maar kwam niet aan op AWS. Root cause gevonden: requestTargetEvaluation op de queue-binding stond op "none", dus "${topic()}" werd nooit geëvalueerd -- elke queue-binding postte naar het letterlijke pad "/${topic()}", vermoedelijk geblokkeerd door een WAF (Log4Shell-achtig patroon). Gefixt in configure-rdp-export.sh. Vervolg: een herhaalde diagnose (ronde 5, spooledMsgCount inmiddels 20) bevestigt dat de fix daadwerkelijk live staat, maar de 503 en httpRequestTxMsgCount: 0 blijven volledig ongewijzigd -- dus niet de (enige) oorzaak. Nieuw spoor: de REST-consumer toont "lastConnectionFailureReason": "Peer TCP Closed" -- mogelijk sluit de cloud-broker de persistente verbindingspool van de RDP actief, terwijl een losse curl-POST (nieuwe verbinding per keer) altijd wél slaagt. Nieuw diagnosescript watch-rdp-live.sh moet dit bevestigen of ontkrachten -- de eerste run leverde alleen null-waarden op door een bug in het script zelf (jq-filter las van het verkeerde JSON-niveau), inmiddels gefixt; een tweede run is nodig voor een echte uitspraak.</w:t>
       </w:r>
     </w:p>
     <w:p>
@@ -1992,7 +1992,7 @@
         <w:spacing w:after="80"/>
       </w:pPr>
       <w:r>
-        <w:t xml:space="preserve">Publish-test draaien, meteen daarna het nieuwe watch-rdp-live.sh (30s polling, elke 2s) om te zien of de HTTP-tellers ooit bewegen en of de verbindingen in een continue connect/drop-lus zitten.</w:t>
+        <w:t xml:space="preserve">~~watch-rdp-live.sh draaien.~~ ✅ (poging 1) -- alleen null-waarden door een bug in het script se jq-filter (las van het top-level object i.p.v. .data); gefixt, geen nieuwe broker-info. Nu: nogmaals draaien (er liggen al 30 berichten in q-export-public, geen nieuwe publish-test nodig) om te zien of de HTTP-tellers ooit bewegen en of de verbindingen in een continue connect/drop-lus zitten.</w:t>
       </w:r>
     </w:p>
     <w:p>

</xml_diff>

<commit_message>
Confirm AWS-side sanity check: direct curl succeeds, message visible in Try Me!
A manual curl POST straight to AWS's REST endpoint, using the exact same
enewable-local-bridge credentials the RDP's rest-consumer uses, returns
HTTP 200 OK and the message appears immediately in AWS's Try Me!
subscriber (topic enewable/public/curl-sanity-check, Direct). This
confirms AWS-side credentials, REST-incoming, TLS/port, and
topic-to-URL-path mapping are all correct -- the problem is isolated
entirely to the local broker (the rdp-deliver client-profile fix from the
previous commit), not anything on the AWS/cloud side.

Updates PLAN.md (section 13 item 27, section 14 step 4) and rebuilds the
docx summary.

Co-Authored-By: Claude Sonnet 5 <noreply@anthropic.com>
Claude-Session: https://claude.ai/code/session_01LyLzg69DjEjtAeYz9FrHW3
</commit_message>
<xml_diff>
--- a/docs/Plan-van-aanpak-DADD2026-Enewable.docx
+++ b/docs/Plan-van-aanpak-DADD2026-Enewable.docx
@@ -60,7 +60,7 @@
           <w:sz w:val="20"/>
           <w:szCs w:val="20"/>
         </w:rPr>
-        <w:t xml:space="preserve">Voortgang: bridge-export bleek alleen te kunnen importeren, niet exporteren, zonder een publiek bereikbare lokale broker -- Emil koos daarop queues + REST Delivery Points (RDP's): demo-apps blijven ongewijzigd DIRECT publiceren, 3 queues vangen dit automatisch op (Solace "message promotion"), 3 RDP's sturen elke queue native door naar de bijbehorende cloud-broker. Oude bridge-configuratie opgeruimd. Eerste testrun faalde op de rest-consumers door een verkeerde authenticationScheme-waarde ("basic" i.p.v. "http-basic") -- gefixt, en de herhaalde run draait nu volledig schoon (0 WARN). Broker Manager toont echter alle 3 RDP's als "Down" met HTTP 503 "Service Unavailable" op de queue-binding. Een directe curl-POST naar alle 3 cloud-brokers, met dezelfde host/poort/credentials/topic-constructie als de RDP gebruikt, lukt gewoon (200 OK) -- dit sluit REST-incoming-uitgeschakeld, verkeerde auth, host/poort en topic-mapping definitief uit; de REST-consumer se eigen tellers staan nog op 0 (nog nooit een échte berichtaflevering geprobeerd). De eerste poging tot een echte end-to-end publish-test liep meteen vast op de demo-app zelf: de geïnstalleerde Solace Try-Me CLI (stm v1.0.0) kent geen "publish"-subcommando, alleen "send" -- gefixt in publish-public.sh. Na die fix loopt de test alweer vast, nu op een nieuw en apart probleem: de lokale broker wijst pub-public af met "The RADIUS profile is shutdown" -- dit gebeurt vóórdat de RDP-keten zelfs bereikt wordt, dus los van het 503-onderzoek. Bevestigd en gefixt: de enewable-VPN se auth-type stond daadwerkelijk op "radius" zonder enig RADIUS-profiel; configure-local-broker.sh PATCHt de VPN nu naar "internal". Na die fix lukte de verbinding, maar elk bericht werd geweigerd ("Sending guaranteed message is not allowed by router for this client"): stm send publiceert standaard PERSISTENT, niet DIRECT. Ook gefixt: --delivery-mode DIRECT toegevoegd. Daarna landde het bericht eindelijk in de lokale queue (message-promotion bevestigd werkend, spooledMsgCount: 10), maar kwam niet aan op AWS. Root cause gevonden: requestTargetEvaluation op de queue-binding stond op "none", dus "${topic()}" werd nooit geëvalueerd -- elke queue-binding postte naar het letterlijke pad "/${topic()}", vermoedelijk geblokkeerd door een WAF (Log4Shell-achtig patroon). Gefixt in configure-rdp-export.sh. Vervolg: een herhaalde diagnose (ronde 5, spooledMsgCount inmiddels 20) bevestigt dat de fix daadwerkelijk live staat, maar de 503 en httpRequestTxMsgCount: 0 blijven volledig ongewijzigd -- dus niet de (enige) oorzaak. Nieuw spoor: de REST-consumer toont "lastConnectionFailureReason": "Peer TCP Closed" -- mogelijk sluit de cloud-broker de persistente verbindingspool van de RDP actief, terwijl een losse curl-POST (nieuwe verbinding per keer) altijd wél slaagt. Nieuw diagnosescript watch-rdp-live.sh moet dit bevestigen of ontkrachten -- de eerste run leverde alleen null-waarden op door een bug in het script zelf (jq-filter las van het verkeerde JSON-niveau), inmiddels gefixt. De herhaalde run met correcte data toont de echte root cause: de queue-binding bindt zich nooit aan zijn eigen lokale queue (bindRequestCount: 0, "Consumers: 0" in Broker Manager) omdat clientProfileName "default" (gebruikt door zowel de RDP als de demo-app publishers) allowGuaranteedMsgReceiveEnabled: false heeft -- en een RDP-binding is precies een guaranteed-receive-operatie. Het "Peer TCP Closed"-spoor bleek een rode haring: de binding faalt onafhankelijk van of de REST-consumer gezond is. Gefixt: een los clientprofiel "rdp-deliver" met allowGuaranteedMsgReceiveEnabled: true, en alle 3 RDP's daarop gezet.</w:t>
+        <w:t xml:space="preserve">Voortgang: bridge-export bleek alleen te kunnen importeren, niet exporteren, zonder een publiek bereikbare lokale broker -- Emil koos daarop queues + REST Delivery Points (RDP's): demo-apps blijven ongewijzigd DIRECT publiceren, 3 queues vangen dit automatisch op (Solace "message promotion"), 3 RDP's sturen elke queue native door naar de bijbehorende cloud-broker. Oude bridge-configuratie opgeruimd. Eerste testrun faalde op de rest-consumers door een verkeerde authenticationScheme-waarde ("basic" i.p.v. "http-basic") -- gefixt, en de herhaalde run draait nu volledig schoon (0 WARN). Broker Manager toont echter alle 3 RDP's als "Down" met HTTP 503 "Service Unavailable" op de queue-binding. Een directe curl-POST naar alle 3 cloud-brokers, met dezelfde host/poort/credentials/topic-constructie als de RDP gebruikt, lukt gewoon (200 OK) -- dit sluit REST-incoming-uitgeschakeld, verkeerde auth, host/poort en topic-mapping definitief uit; de REST-consumer se eigen tellers staan nog op 0 (nog nooit een échte berichtaflevering geprobeerd). De eerste poging tot een echte end-to-end publish-test liep meteen vast op de demo-app zelf: de geïnstalleerde Solace Try-Me CLI (stm v1.0.0) kent geen "publish"-subcommando, alleen "send" -- gefixt in publish-public.sh. Na die fix loopt de test alweer vast, nu op een nieuw en apart probleem: de lokale broker wijst pub-public af met "The RADIUS profile is shutdown" -- dit gebeurt vóórdat de RDP-keten zelfs bereikt wordt, dus los van het 503-onderzoek. Bevestigd en gefixt: de enewable-VPN se auth-type stond daadwerkelijk op "radius" zonder enig RADIUS-profiel; configure-local-broker.sh PATCHt de VPN nu naar "internal". Na die fix lukte de verbinding, maar elk bericht werd geweigerd ("Sending guaranteed message is not allowed by router for this client"): stm send publiceert standaard PERSISTENT, niet DIRECT. Ook gefixt: --delivery-mode DIRECT toegevoegd. Daarna landde het bericht eindelijk in de lokale queue (message-promotion bevestigd werkend, spooledMsgCount: 10), maar kwam niet aan op AWS. Root cause gevonden: requestTargetEvaluation op de queue-binding stond op "none", dus "${topic()}" werd nooit geëvalueerd -- elke queue-binding postte naar het letterlijke pad "/${topic()}", vermoedelijk geblokkeerd door een WAF (Log4Shell-achtig patroon). Gefixt in configure-rdp-export.sh. Vervolg: een herhaalde diagnose (ronde 5, spooledMsgCount inmiddels 20) bevestigt dat de fix daadwerkelijk live staat, maar de 503 en httpRequestTxMsgCount: 0 blijven volledig ongewijzigd -- dus niet de (enige) oorzaak. Nieuw spoor: de REST-consumer toont "lastConnectionFailureReason": "Peer TCP Closed" -- mogelijk sluit de cloud-broker de persistente verbindingspool van de RDP actief, terwijl een losse curl-POST (nieuwe verbinding per keer) altijd wél slaagt. Nieuw diagnosescript watch-rdp-live.sh moet dit bevestigen of ontkrachten -- de eerste run leverde alleen null-waarden op door een bug in het script zelf (jq-filter las van het verkeerde JSON-niveau), inmiddels gefixt. De herhaalde run met correcte data toont de echte root cause: de queue-binding bindt zich nooit aan zijn eigen lokale queue (bindRequestCount: 0, "Consumers: 0" in Broker Manager) omdat clientProfileName "default" (gebruikt door zowel de RDP als de demo-app publishers) allowGuaranteedMsgReceiveEnabled: false heeft -- en een RDP-binding is precies een guaranteed-receive-operatie. Het "Peer TCP Closed"-spoor bleek een rode haring: de binding faalt onafhankelijk van of de REST-consumer gezond is. Gefixt: een los clientprofiel "rdp-deliver" met allowGuaranteedMsgReceiveEnabled: true, en alle 3 RDP's daarop gezet. Sanity-check vóór het toepassen: een handmatige curl-POST rechtstreeks naar AWS (zelfde credentials als de RDP) geeft 200 OK en het bericht verschijnt meteen in AWS "Try Me!" -- AWS-kant, credentials en topic-mapping zijn dus 100% in orde, het probleem zat uitsluitend lokaal.</w:t>
       </w:r>
     </w:p>
     <w:p>
@@ -2005,7 +2005,20 @@
         <w:spacing w:after="80"/>
       </w:pPr>
       <w:r>
-        <w:t xml:space="preserve">configure-rdp-export.sh opnieuw draaien (zet de 3 RDP's op het nieuwe profiel), dan diagnose-rdp.sh en de AWS "Try Me!"-tab controleren of het bericht nu eindelijk aankomt.</w:t>
+        <w:t xml:space="preserve">~~Sanity-check: handmatige curl-POST rechtstreeks naar AWS.~~ ✅ -- 200 OK, bericht verschijnt meteen in AWS "Try Me!": AWS-kant, credentials en topic-mapping zijn 100% in orde, het probleem zit uitsluitend lokaal.</w:t>
+      </w:r>
+    </w:p>
+    <w:p>
+      <w:pPr>
+        <w:pStyle w:val="ListParagraph"/>
+        <w:numPr>
+          <w:ilvl w:val="0"/>
+          <w:numId w:val="2"/>
+        </w:numPr>
+        <w:spacing w:after="80"/>
+      </w:pPr>
+      <w:r>
+        <w:t xml:space="preserve">configure-rdp-export.sh opnieuw draaien (zet de 3 RDP's op het nieuwe rdp-deliver-profiel), dan diagnose-rdp.sh en de AWS "Try Me!"-tab controleren of het bericht nu via de RDP-keten eindelijk aankomt.</w:t>
       </w:r>
     </w:p>
     <w:p>

</xml_diff>

<commit_message>
Document and fix sdkperf_java.sh not-on-PATH issue for STACKIT test
publish-pii.sh already supports an SDKPERF_BIN override and already
auto-sources local-broker/.env, so the fix is just documenting the
override in .env.example and setting it in Emil's real .env to point
at his actual SDKPerf install location. No script changes needed.

Co-Authored-By: Claude Sonnet 5 <noreply@anthropic.com>
Claude-Session: https://claude.ai/code/session_01LyLzg69DjEjtAeYz9FrHW3
</commit_message>
<xml_diff>
--- a/docs/Plan-van-aanpak-DADD2026-Enewable.docx
+++ b/docs/Plan-van-aanpak-DADD2026-Enewable.docx
@@ -1640,7 +1640,7 @@
                 <w:b w:val="false"/>
                 <w:bCs w:val="false"/>
               </w:rPr>
-              <w:t xml:space="preserve">🟡 stm-public (AWS) ✅ en python-eu-nonpersonal (Azure) ✅ bevestigd, elk alleen op de eigen broker; sdkperf-pii (STACKIT) nog te doen</w:t>
+              <w:t xml:space="preserve">🟡 2/3: stm-public (AWS) ✅ en python-eu-nonpersonal (Azure) ✅ bevestigd, elk alleen op de eigen broker; sdkperf-pii (STACKIT) klaar om te retesten na een PATH-fix (SDKPERF_BIN)</w:t>
             </w:r>
           </w:p>
         </w:tc>
@@ -2031,7 +2031,7 @@
         <w:spacing w:after="80"/>
       </w:pPr>
       <w:r>
-        <w:t xml:space="preserve">Eerste end-to-end testronde: publiceren met stm/python/sdkperf en per cloud-broker controleren dat het bericht op dezelfde topic aankomt, en nergens anders. ~~stm-public -&gt; AWS.~~ ✅ ~~python-eu-nonpersonal -&gt; Azure.~~ ✅ (20 berichten, na een zsh-commentaar-instructiefout hersteld). sdkperf-pii -&gt; STACKIT: nog te doen.</w:t>
+        <w:t xml:space="preserve">Eerste end-to-end testronde: publiceren met stm/python/sdkperf en per cloud-broker controleren dat het bericht op dezelfde topic aankomt, en nergens anders. ~~stm-public -&gt; AWS.~~ ✅ ~~python-eu-nonpersonal -&gt; Azure.~~ ✅ (20 berichten, na een zsh-commentaar-instructiefout hersteld). sdkperf-pii -&gt; STACKIT: liep vast op sdkperf_java.sh niet op PATH (Emils omgeving) -- gefixt via SDKPERF_BIN in local-broker/.env; klaar om te retesten.</w:t>
       </w:r>
     </w:p>
     <w:p>

</xml_diff>

<commit_message>
Confirm full end-to-end test round: all 3 demo-apps -> correct cloud broker
sdkperf-pii -> STACKIT succeeded after the SDKPERF_BIN PATH fix: 20 Direct
messages delivered to STACKIT (GCP-interim) Try Me! on
enewable/eu/pii/meter/reading. Combined with the earlier AWS and Azure
confirmations, this closes the full section 12 test plan: each demo app
now lands only on its own target cloud broker.

Co-Authored-By: Claude Sonnet 5 <noreply@anthropic.com>
Claude-Session: https://claude.ai/code/session_01LyLzg69DjEjtAeYz9FrHW3
</commit_message>
<xml_diff>
--- a/docs/Plan-van-aanpak-DADD2026-Enewable.docx
+++ b/docs/Plan-van-aanpak-DADD2026-Enewable.docx
@@ -1558,7 +1558,7 @@
                 <w:b w:val="false"/>
                 <w:bCs w:val="false"/>
               </w:rPr>
-              <w:t xml:space="preserve">✅✅ Volledig werkend, end-to-end bevestigd op AWS: alle 3 queue-bindings up:true met bindSuccessCount:1, RDP-aws leverde 21 berichten daadwerkelijk af, zichtbaar in AWS "Try Me!" op enewable/public/market/price. Azure/STACKIT staan klaar, nog ongetest</w:t>
+              <w:t xml:space="preserve">✅✅ Volledig werkend, end-to-end bevestigd op alle 3 cloud-brokers (AWS, Azure, STACKIT/GCP-interim)</w:t>
             </w:r>
           </w:p>
         </w:tc>
@@ -1578,7 +1578,7 @@
                 <w:b w:val="false"/>
                 <w:bCs w:val="false"/>
               </w:rPr>
-              <w:t xml:space="preserve">Fase 5: volledige testronde met alle 3 demo-apps (stm/python/sdkperf) op alle 3 topic-subtrees</w:t>
+              <w:t xml:space="preserve">Fase 5 afgerond, 3/3 geslaagd. Volgende: draaiboek + fallback-opname (sectie 14, stap 6)</w:t>
             </w:r>
           </w:p>
         </w:tc>
@@ -1640,7 +1640,7 @@
                 <w:b w:val="false"/>
                 <w:bCs w:val="false"/>
               </w:rPr>
-              <w:t xml:space="preserve">🟡 2/3: stm-public (AWS) ✅ en python-eu-nonpersonal (Azure) ✅ bevestigd, elk alleen op de eigen broker; sdkperf-pii (STACKIT) klaar om te retesten na een PATH-fix (SDKPERF_BIN)</w:t>
+              <w:t xml:space="preserve">✅✅ 3/3: stm-public (AWS), python-eu-nonpersonal (Azure) en sdkperf-pii (STACKIT) alle drie bevestigd, elk uitsluitend op de eigen doelbroker</w:t>
             </w:r>
           </w:p>
         </w:tc>
@@ -1660,7 +1660,7 @@
                 <w:b w:val="false"/>
                 <w:bCs w:val="false"/>
               </w:rPr>
-              <w:t xml:space="preserve">Meerdere keren vóór DADD</w:t>
+              <w:t xml:space="preserve">Herhalen vóór DADD zelf als extra zekerheid</w:t>
             </w:r>
           </w:p>
         </w:tc>
@@ -2031,7 +2031,7 @@
         <w:spacing w:after="80"/>
       </w:pPr>
       <w:r>
-        <w:t xml:space="preserve">Eerste end-to-end testronde: publiceren met stm/python/sdkperf en per cloud-broker controleren dat het bericht op dezelfde topic aankomt, en nergens anders. ~~stm-public -&gt; AWS.~~ ✅ ~~python-eu-nonpersonal -&gt; Azure.~~ ✅ (20 berichten, na een zsh-commentaar-instructiefout hersteld). sdkperf-pii -&gt; STACKIT: liep vast op sdkperf_java.sh niet op PATH (Emils omgeving) -- gefixt via SDKPERF_BIN in local-broker/.env; klaar om te retesten.</w:t>
+        <w:t xml:space="preserve">~~Eerste end-to-end testronde: publiceren met stm/python/sdkperf en per cloud-broker controleren dat het bericht op dezelfde topic aankomt, en nergens anders.~~ ✅ Afgerond, 3/3: stm-public -&gt; AWS. python-eu-nonpersonal -&gt; Azure (20 berichten, na een zsh-commentaar-instructiefout hersteld). sdkperf-pii -&gt; STACKIT (20 berichten, na een SDKPERF_BIN PATH-fix). Elke app landt uitsluitend op zijn eigen doelbroker.</w:t>
       </w:r>
     </w:p>
     <w:p>

</xml_diff>

<commit_message>
Dynamische topics: veldwaarden uit het bericht toegevoegd
Elke topic krijgt nu extra niveaus met echte veldwaarden uit het
bericht zelf: enewable/public/market/price/<type>/<market>,
enewable/eu/ops/grid/load/<type>/<postcodeArea>,
enewable/eu/pii/meter/reading/<customerId>. Geen broker-wijziging
nodig -- alle ACL's en RDP-export-queues staan al op de hele
topic-subtree (multi-level wildcard).

stm/sdkperf lezen de velden uit hun statische sample-payload-bestand
(json_field()-helper, met jq of een grep/sed-fallback); het
Python-script bouwt de topic per bericht op omdat postcodeArea/
customerId daar per bericht rouleren. Bevestigd via dry-runs (json_field
tegen de echte payloadbestanden, gestubde publish_class-aanroepen,
publisher.py's topic-opbouwlogica los getest).

Co-Authored-By: Claude Sonnet 5 <noreply@anthropic.com>
Claude-Session: https://claude.ai/code/session_01LyLzg69DjEjtAeYz9FrHW3
</commit_message>
<xml_diff>
--- a/docs/Plan-van-aanpak-DADD2026-Enewable.docx
+++ b/docs/Plan-van-aanpak-DADD2026-Enewable.docx
@@ -694,7 +694,7 @@
                 <w:b/>
                 <w:bCs/>
               </w:rPr>
-              <w:t xml:space="preserve">Voorbeeld</w:t>
+              <w:t xml:space="preserve">Voorbeeld (dynamische topic)</w:t>
             </w:r>
           </w:p>
         </w:tc>
@@ -780,7 +780,7 @@
                 <w:b w:val="false"/>
                 <w:bCs w:val="false"/>
               </w:rPr>
-              <w:t xml:space="preserve">Day-ahead energieprijs, weerdata</w:t>
+              <w:t xml:space="preserve">.../price/day-ahead-price/NL</w:t>
             </w:r>
           </w:p>
         </w:tc>
@@ -866,7 +866,7 @@
                 <w:b w:val="false"/>
                 <w:bCs w:val="false"/>
               </w:rPr>
-              <w:t xml:space="preserve">Geaggregeerde netbelasting</w:t>
+              <w:t xml:space="preserve">.../load/grid-load-aggregate/3500-NL</w:t>
             </w:r>
           </w:p>
         </w:tc>
@@ -952,7 +952,7 @@
                 <w:b w:val="false"/>
                 <w:bCs w:val="false"/>
               </w:rPr>
-              <w:t xml:space="preserve">Meterstand + klant-ID</w:t>
+              <w:t xml:space="preserve">.../reading/ENW-NL-000482</w:t>
             </w:r>
           </w:p>
         </w:tc>
@@ -1051,6 +1051,19 @@
       </w:pPr>
       <w:r>
         <w:t xml:space="preserve">STACKIT: uitgangspunt is dat STACKIT komende week algemeen beschikbaar (GA) is in Solace Cloud, met dezelfde self-service deployment als AWS/Azure/GCP. Tot het zover is, mimicken we het sovereign-knooppunt met een Solace Cloud HA-broker op GCP europe-west1 (België) -- zelfde topics, ACL's en bridge-naam, alleen het fysieke eindpunt wisselt bij de overstap.</w:t>
+      </w:r>
+    </w:p>
+    <w:p>
+      <w:pPr>
+        <w:pStyle w:val="ListParagraph"/>
+        <w:numPr>
+          <w:ilvl w:val="0"/>
+          <w:numId w:val="2"/>
+        </w:numPr>
+        <w:spacing w:after="80"/>
+      </w:pPr>
+      <w:r>
+        <w:t xml:space="preserve">Topics zijn dynamisch: elke tool voegt echte veldwaarden uit het bericht toe aan de topic (bijv. .../price/day-ahead-price/NL, .../reading/ENW-NL-000482), niet een vaste string. Werkt zonder broker-wijziging, want alle ACL's en RDP-export-queues staan al op de hele topic-subtree (multi-level wildcard), niet op één exacte topic.</w:t>
       </w:r>
     </w:p>
     <w:p>

</xml_diff>

<commit_message>
De 3 cloud-broker-services opnieuw aangemaakt via Terraform; .env bijgewerkt
Alle 3 Solace Cloud services (AWS, Azure, STACKIT) succesvol aangemaakt
met de nieuwe Terraform-opzet (cloud-setup/terraform/). STACKIT bleek
inmiddels een eigen, echte dedicated datacenter te hebben in Solace
Cloud, dus de eerder voorziene GCP-interim-stand-in is niet nodig
gebleken; service_class_id "DEVELOPER" is bevestigd correct.
local-broker/.env (niet in git) is bijgewerkt met de nieuwe
SMF/SEMP-hostnames, VPN-naam enewable en SEMP-admin-credentials.

PLAN.md en TODO.md bijgewerkt (nieuw punt 42, blokkerende sectie deels
afgevinkt), cloud-setup/README.md-statusmelding en de Word-samenvatting
meegenomen.

Co-Authored-By: Claude Sonnet 5 <noreply@anthropic.com>
Claude-Session: https://claude.ai/code/session_01LyLzg69DjEjtAeYz9FrHW3
</commit_message>
<xml_diff>
--- a/docs/Plan-van-aanpak-DADD2026-Enewable.docx
+++ b/docs/Plan-van-aanpak-DADD2026-Enewable.docx
@@ -76,7 +76,7 @@
           <w:sz w:val="20"/>
           <w:szCs w:val="20"/>
         </w:rPr>
-        <w:t xml:space="preserve">Status (01/10/2026): de 3 cloud-broker-services hierboven zijn inmiddels verwijderd en worden opnieuw aangemaakt -- nu als "Developer 100"-tier (niet-HA) verdeeld over twee Solace Cloud-organisaties (AWS+Azure in de ene, STACKIT in de andere), via een nieuwe Terraform-opzet (cloud-setup/terraform/, Solace's eigen beta-provider) i.p.v. de eerdere Enterprise-250-HA-klasse in één org. Zie PLAN.md sectie 13, punt 40 en TODO.md, "Blokkerend", voor de volledige details en openstaande aannames (o.a. de exacte serviceClassId-schrijfwijze en of STACKIT al echt GA is).</w:t>
+        <w:t xml:space="preserve">Status (02/10/2026): de 3 cloud-broker-services hierboven zijn opnieuw aangemaakt -- nu als "Developer 100"-tier (niet-HA) verdeeld over twee Solace Cloud-organisaties (AWS+Azure in de ene, STACKIT in de andere), via een nieuwe Terraform-opzet (cloud-setup/terraform/, Solace's eigen beta-provider) i.p.v. de eerdere Enterprise-250-HA-klasse in één org. STACKIT bleek daarbij een eigen, echte dedicated datacenter te hebben -- de eerder voorziene GCP-interim-stand-in is niet nodig gebleken. local-broker/.env is bijgewerkt met de nieuwe hostnames/VPN-naam/SEMP-credentials; de configuratiescripts (bridge-user, lokale broker, RDP-export) moeten nog opnieuw draaien vóór een hernieuwde end-to-end-bevestiging. Zie PLAN.md sectie 13, punt 42 en TODO.md voor de volledige details.</w:t>
       </w:r>
     </w:p>
     <w:p>
@@ -404,7 +404,7 @@
                 <w:b w:val="false"/>
                 <w:bCs w:val="false"/>
               </w:rPr>
-              <w:t xml:space="preserve">Solace Cloud, Developer 100 (non-HA) -- opnieuw aan te maken via Terraform, org 1</w:t>
+              <w:t xml:space="preserve">Solace Cloud, Developer 100 (non-HA) -- opnieuw aangemaakt via Terraform, org 1</w:t>
             </w:r>
           </w:p>
         </w:tc>
@@ -490,7 +490,7 @@
                 <w:b w:val="false"/>
                 <w:bCs w:val="false"/>
               </w:rPr>
-              <w:t xml:space="preserve">Solace Cloud, Developer 100 (non-HA) -- opnieuw aan te maken via Terraform, org 1</w:t>
+              <w:t xml:space="preserve">Solace Cloud, Developer 100 (non-HA) -- opnieuw aangemaakt via Terraform, org 1</w:t>
             </w:r>
           </w:p>
         </w:tc>
@@ -576,7 +576,7 @@
                 <w:b w:val="false"/>
                 <w:bCs w:val="false"/>
               </w:rPr>
-              <w:t xml:space="preserve">Solace Cloud, Developer 100 (non-HA) -- opnieuw aan te maken via Terraform, org 2; GA-status te bevestigen</w:t>
+              <w:t xml:space="preserve">Solace Cloud, Developer 100 (non-HA) -- opnieuw aangemaakt via Terraform, org 2; eigen, echte dedicated datacenter (GA)</w:t>
             </w:r>
           </w:p>
         </w:tc>
@@ -1066,7 +1066,7 @@
         <w:spacing w:after="80"/>
       </w:pPr>
       <w:r>
-        <w:t xml:space="preserve">STACKIT: uitgangspunt is dat STACKIT komende week algemeen beschikbaar (GA) is in Solace Cloud, met dezelfde self-service deployment als AWS/Azure/GCP. Tot het zover is, mimicken we het sovereign-knooppunt met een Solace Cloud HA-broker op GCP europe-west1 (België) -- zelfde topics, ACL's en bridge-naam, alleen het fysieke eindpunt wisselt bij de overstap.</w:t>
+        <w:t xml:space="preserve">STACKIT: inmiddels bevestigd als eigen, echte dedicated datacenter in Solace Cloud (geen GCP-interim-stand-in meer nodig) -- zelfde topics en ACL's als AWS/Azure, alleen het fysieke eindpunt is STACKIT in plaats van een hyperscaler.</w:t>
       </w:r>
     </w:p>
     <w:p>
@@ -1284,7 +1284,6 @@
         <w:tc>
           <w:tcPr>
             <w:tcW w:type="dxa" w:w="700"/>
-            <w:shd w:fill="FFF9C4" w:val="clear"/>
             <w:tcMar>
               <w:top w:type="dxa" w:w="80"/>
               <w:left w:type="dxa" w:w="100"/>
@@ -1305,7 +1304,6 @@
         <w:tc>
           <w:tcPr>
             <w:tcW w:type="dxa" w:w="2600"/>
-            <w:shd w:fill="FFF9C4" w:val="clear"/>
             <w:tcMar>
               <w:top w:type="dxa" w:w="80"/>
               <w:left w:type="dxa" w:w="100"/>
@@ -1326,42 +1324,40 @@
         <w:tc>
           <w:tcPr>
             <w:tcW w:type="dxa" w:w="3400"/>
-            <w:shd w:fill="FFF9C4" w:val="clear"/>
-            <w:tcMar>
-              <w:top w:type="dxa" w:w="80"/>
-              <w:left w:type="dxa" w:w="100"/>
-              <w:bottom w:type="dxa" w:w="80"/>
-              <w:right w:type="dxa" w:w="100"/>
-            </w:tcMar>
-          </w:tcPr>
-          <w:p>
-            <w:r>
-              <w:rPr>
-                <w:b w:val="false"/>
-                <w:bCs w:val="false"/>
-              </w:rPr>
-              <w:t xml:space="preserve">✅ Interim-broker op GCP europe-west1 aangemaakt; vóór repetitie/DADD checken of STACKIT al GA is</w:t>
+            <w:tcMar>
+              <w:top w:type="dxa" w:w="80"/>
+              <w:left w:type="dxa" w:w="100"/>
+              <w:bottom w:type="dxa" w:w="80"/>
+              <w:right w:type="dxa" w:w="100"/>
+            </w:tcMar>
+          </w:tcPr>
+          <w:p>
+            <w:r>
+              <w:rPr>
+                <w:b w:val="false"/>
+                <w:bCs w:val="false"/>
+              </w:rPr>
+              <w:t xml:space="preserve">✅✅ STACKIT blijkt inmiddels een eigen, echte dedicated datacenter te hebben in Solace Cloud -- geen GCP-interim-stand-in meer nodig</w:t>
             </w:r>
           </w:p>
         </w:tc>
         <w:tc>
           <w:tcPr>
             <w:tcW w:type="dxa" w:w="2326"/>
-            <w:shd w:fill="FFF9C4" w:val="clear"/>
-            <w:tcMar>
-              <w:top w:type="dxa" w:w="80"/>
-              <w:left w:type="dxa" w:w="100"/>
-              <w:bottom w:type="dxa" w:w="80"/>
-              <w:right w:type="dxa" w:w="100"/>
-            </w:tcMar>
-          </w:tcPr>
-          <w:p>
-            <w:r>
-              <w:rPr>
-                <w:b w:val="false"/>
-                <w:bCs w:val="false"/>
-              </w:rPr>
-              <w:t xml:space="preserve">Interim: gereed</w:t>
+            <w:tcMar>
+              <w:top w:type="dxa" w:w="80"/>
+              <w:left w:type="dxa" w:w="100"/>
+              <w:bottom w:type="dxa" w:w="80"/>
+              <w:right w:type="dxa" w:w="100"/>
+            </w:tcMar>
+          </w:tcPr>
+          <w:p>
+            <w:r>
+              <w:rPr>
+                <w:b w:val="false"/>
+                <w:bCs w:val="false"/>
+              </w:rPr>
+              <w:t xml:space="preserve">GA bevestigd</w:t>
             </w:r>
           </w:p>
         </w:tc>
@@ -1423,7 +1419,7 @@
                 <w:b w:val="false"/>
                 <w:bCs w:val="false"/>
               </w:rPr>
-              <w:t xml:space="preserve">✅ Account + API-token aangemaakt</w:t>
+              <w:t xml:space="preserve">✅ Account + API-token aangemaakt (2 org's, 2 tokens)</w:t>
             </w:r>
           </w:p>
         </w:tc>
@@ -1505,7 +1501,7 @@
                 <w:b w:val="false"/>
                 <w:bCs w:val="false"/>
               </w:rPr>
-              <w:t xml:space="preserve">⚠️ Services verwijderd (01/10/2026), opnieuw aanmaken via Terraform (Developer 100-tier, 2 org's) -- zie cloud-setup/terraform/</w:t>
+              <w:t xml:space="preserve">✅✅ Services opnieuw aangemaakt via Terraform (Developer 100-tier, 2 org's) -- zie cloud-setup/terraform/, PLAN.md sectie 13 punt 42</w:t>
             </w:r>
           </w:p>
         </w:tc>
@@ -1525,7 +1521,7 @@
                 <w:b w:val="false"/>
                 <w:bCs w:val="false"/>
               </w:rPr>
-              <w:t xml:space="preserve">In uitvoering</w:t>
+              <w:t xml:space="preserve">Afgerond, 02/10/2026</w:t>
             </w:r>
           </w:p>
         </w:tc>
@@ -1587,7 +1583,7 @@
                 <w:b w:val="false"/>
                 <w:bCs w:val="false"/>
               </w:rPr>
-              <w:t xml:space="preserve">✅✅ Volledig werkend, end-to-end bevestigd op alle 3 cloud-brokers (AWS, Azure, STACKIT/GCP-interim)</w:t>
+              <w:t xml:space="preserve">✅ Eerder volledig end-to-end bevestigd, maar tegen de inmiddels verwijderde cloud-services -- local-broker/.env staat al op de nieuwe services; configure-remote-bridge-users.sh/configure-local-broker.sh/configure-rdp-export.sh moeten opnieuw draaien vóór hernieuwde bevestiging</w:t>
             </w:r>
           </w:p>
         </w:tc>
@@ -1607,7 +1603,7 @@
                 <w:b w:val="false"/>
                 <w:bCs w:val="false"/>
               </w:rPr>
-              <w:t xml:space="preserve">Fase 5 afgerond, 3/3 geslaagd. Volgende: draaiboek + fallback-opname (sectie 14, stap 6)</w:t>
+              <w:t xml:space="preserve">Opnieuw te bevestigen tegen nieuwe services</w:t>
             </w:r>
           </w:p>
         </w:tc>
@@ -1669,7 +1665,7 @@
                 <w:b w:val="false"/>
                 <w:bCs w:val="false"/>
               </w:rPr>
-              <w:t xml:space="preserve">✅✅ 3/3: stm-public, python-eu-nonpersonal en sdkperf-pii alle drie bevestigd. Sindsdien versterkt: elke app publiceert nu alle 3 dataklassen per run (AWS+Azure+STACKIT), niet meer maar één per app</w:t>
+              <w:t xml:space="preserve">✅ Eerder 3/3 bevestigd (stm-public, python-eu-nonpersonal, sdkperf-pii, elk alle 3 dataklassen per run) -- zelfde kanttekening als fase 4, herhalen tegen de nieuwe services</w:t>
             </w:r>
           </w:p>
         </w:tc>
@@ -1689,7 +1685,7 @@
                 <w:b w:val="false"/>
                 <w:bCs w:val="false"/>
               </w:rPr>
-              <w:t xml:space="preserve">Herhalen vóór DADD zelf als extra zekerheid</w:t>
+              <w:t xml:space="preserve">Herhalen na fase 4, en nogmaals vóór DADD zelf</w:t>
             </w:r>
           </w:p>
         </w:tc>
@@ -1895,7 +1891,7 @@
         <w:spacing w:after="80"/>
       </w:pPr>
       <w:r>
-        <w:t xml:space="preserve">STACKIT GA-timing is een restrisico, geen kernonzekerheid meer: mocht de planning schuiven, draait de demo door op de GCP-europe-west1-interim-broker -- controleer dit kort vóór de repetitie/DADD.</w:t>
+        <w:t xml:space="preserve">Public clusters in plaats van private/VPC-gepeerd: bewuste vereenvoudiging voor de demo, benoem dit expliciet in de presentatie zelf.</w:t>
       </w:r>
     </w:p>
     <w:p>
@@ -1908,7 +1904,7 @@
         <w:spacing w:after="80"/>
       </w:pPr>
       <w:r>
-        <w:t xml:space="preserve">Public clusters in plaats van private/VPC-gepeerd: bewuste vereenvoudiging voor de demo, benoem dit expliciet in de presentatie zelf.</w:t>
+        <w:t xml:space="preserve">Voor een architecturaal preciezere weergave van #noexport zou een DMR-cluster nodig zijn in plaats van queues/RDP's -- bewust buiten scope voor deze eerste versie.</w:t>
       </w:r>
     </w:p>
     <w:p>
@@ -1921,7 +1917,7 @@
         <w:spacing w:after="80"/>
       </w:pPr>
       <w:r>
-        <w:t xml:space="preserve">Voor een architecturaal preciezere weergave van #noexport zou een DMR-cluster nodig zijn in plaats van queues/RDP's -- bewust buiten scope voor deze eerste versie.</w:t>
+        <w:t xml:space="preserve">De RDP-attribuutnamen zijn gecrosscheckt tegen een werkende Go SEMP-client (Solace's eigen CLI-documentatie geeft geen REST-attribuutnamen); het REST-host/poort per cloud-service (9443) is inmiddels bevestigd correct via de Connect-tab. De resterende "Down"-status is vernauwd tot een HTTP 503 op de queue-binding, met als vermoedelijke oorzaak dat REST-incoming niet aanstaat op de cloud-VPN.</w:t>
       </w:r>
     </w:p>
     <w:p>
@@ -1934,7 +1930,7 @@
         <w:spacing w:after="80"/>
       </w:pPr>
       <w:r>
-        <w:t xml:space="preserve">De RDP-attribuutnamen zijn gecrosscheckt tegen een werkende Go SEMP-client (Solace's eigen CLI-documentatie geeft geen REST-attribuutnamen); het REST-host/poort per cloud-service (9443) is inmiddels bevestigd correct via de Connect-tab. De resterende "Down"-status is vernauwd tot een HTTP 503 op de queue-binding, met als vermoedelijke oorzaak dat REST-incoming niet aanstaat op de cloud-VPN.</w:t>
+        <w:t xml:space="preserve">Geen geautomatiseerde provisioning in één commando, geen monitoring/observability, geen CI -- bewuste keuzes voor een eenmalige demo-opzet, zie PLAN.md voor de volledige afweging.</w:t>
       </w:r>
     </w:p>
     <w:p>
@@ -1947,7 +1943,16 @@
         <w:spacing w:after="80"/>
       </w:pPr>
       <w:r>
-        <w:t xml:space="preserve">Geen geautomatiseerde provisioning in één commando, geen monitoring/observability, geen CI -- bewuste keuzes voor een eenmalige demo-opzet, zie PLAN.md voor de volledige afweging.</w:t>
+        <w:t xml:space="preserve">Azure is fysiek in Nederland maar organisatorisch een Amerikaanse hyperscaler -- de moeite waard om in de presentatie zelf te benoemen.</w:t>
+      </w:r>
+    </w:p>
+    <w:p>
+      <w:pPr>
+        <w:pStyle w:val="Heading1"/>
+        <w:spacing w:after="140" w:before="280"/>
+      </w:pPr>
+      <w:r>
+        <w:t xml:space="preserve">8. Vervolgstappen</w:t>
       </w:r>
     </w:p>
     <w:p>
@@ -1960,16 +1965,7 @@
         <w:spacing w:after="80"/>
       </w:pPr>
       <w:r>
-        <w:t xml:space="preserve">Azure is fysiek in Nederland maar organisatorisch een Amerikaanse hyperscaler -- de moeite waard om in de presentatie zelf te benoemen.</w:t>
-      </w:r>
-    </w:p>
-    <w:p>
-      <w:pPr>
-        <w:pStyle w:val="Heading1"/>
-        <w:spacing w:after="140" w:before="280"/>
-      </w:pPr>
-      <w:r>
-        <w:t xml:space="preserve">8. Vervolgstappen</w:t>
+        <w:t xml:space="preserve">~~test-rest-direct.sh draaien.~~ ✅ -- alle 3 cloud-brokers antwoorden 200 OK; REST-incoming, auth, host/poort en topic-mapping zijn uitgesloten als oorzaak.</w:t>
       </w:r>
     </w:p>
     <w:p>
@@ -1982,7 +1978,7 @@
         <w:spacing w:after="80"/>
       </w:pPr>
       <w:r>
-        <w:t xml:space="preserve">~~test-rest-direct.sh draaien.~~ ✅ -- alle 3 cloud-brokers antwoorden 200 OK; REST-incoming, auth, host/poort en topic-mapping zijn uitgesloten als oorzaak.</w:t>
+        <w:t xml:space="preserve">~~Publish-test + diagnose-rdp.sh, iteratief.~~ ✅ -- vier losse bugs gevonden en gefixt: stm CLI-syntax ("publish" -&gt; "send"), VPN-auth-type (RADIUS -&gt; internal), delivery-mode (PERSISTENT -&gt; DIRECT), en requestTargetEvaluation ("none" -&gt; "substitution-expressions").</w:t>
       </w:r>
     </w:p>
     <w:p>
@@ -1995,7 +1991,7 @@
         <w:spacing w:after="80"/>
       </w:pPr>
       <w:r>
-        <w:t xml:space="preserve">~~Publish-test + diagnose-rdp.sh, iteratief.~~ ✅ -- vier losse bugs gevonden en gefixt: stm CLI-syntax ("publish" -&gt; "send"), VPN-auth-type (RADIUS -&gt; internal), delivery-mode (PERSISTENT -&gt; DIRECT), en requestTargetEvaluation ("none" -&gt; "substitution-expressions").</w:t>
+        <w:t xml:space="preserve">~~configure-rdp-export.sh opnieuw draaien, dan publish-test + diagnose-rdp.sh herhalen.~~ ✅ -- fix bevestigd live, maar de 503 en httpRequestTxMsgCount: 0 blijven ongewijzigd (ronde 5): niet de (enige) oorzaak. Nieuw spoor: REST-consumer toont "Peer TCP Closed" op de persistente verbindingspool.</w:t>
       </w:r>
     </w:p>
     <w:p>
@@ -2008,7 +2004,7 @@
         <w:spacing w:after="80"/>
       </w:pPr>
       <w:r>
-        <w:t xml:space="preserve">~~configure-rdp-export.sh opnieuw draaien, dan publish-test + diagnose-rdp.sh herhalen.~~ ✅ -- fix bevestigd live, maar de 503 en httpRequestTxMsgCount: 0 blijven ongewijzigd (ronde 5): niet de (enige) oorzaak. Nieuw spoor: REST-consumer toont "Peer TCP Closed" op de persistente verbindingspool.</w:t>
+        <w:t xml:space="preserve">~~watch-rdp-live.sh draaien.~~ ✅ -- toont de echte root cause: de queue-binding bindt zich nooit aan zijn eigen lokale queue (bindRequestCount: 0). Oorzaak: clientProfileName "default" (RDP + publishers) heeft allowGuaranteedMsgReceiveEnabled: false. Gefixt met nieuw profiel rdp-deliver.</w:t>
       </w:r>
     </w:p>
     <w:p>
@@ -2021,7 +2017,7 @@
         <w:spacing w:after="80"/>
       </w:pPr>
       <w:r>
-        <w:t xml:space="preserve">~~watch-rdp-live.sh draaien.~~ ✅ -- toont de echte root cause: de queue-binding bindt zich nooit aan zijn eigen lokale queue (bindRequestCount: 0). Oorzaak: clientProfileName "default" (RDP + publishers) heeft allowGuaranteedMsgReceiveEnabled: false. Gefixt met nieuw profiel rdp-deliver.</w:t>
+        <w:t xml:space="preserve">~~Sanity-check: handmatige curl-POST rechtstreeks naar AWS.~~ ✅ -- 200 OK, bericht verschijnt meteen in AWS "Try Me!": AWS-kant, credentials en topic-mapping zijn 100% in orde, het probleem zit uitsluitend lokaal.</w:t>
       </w:r>
     </w:p>
     <w:p>
@@ -2034,7 +2030,7 @@
         <w:spacing w:after="80"/>
       </w:pPr>
       <w:r>
-        <w:t xml:space="preserve">~~Sanity-check: handmatige curl-POST rechtstreeks naar AWS.~~ ✅ -- 200 OK, bericht verschijnt meteen in AWS "Try Me!": AWS-kant, credentials en topic-mapping zijn 100% in orde, het probleem zit uitsluitend lokaal.</w:t>
+        <w:t xml:space="preserve">~~configure-rdp-export.sh opnieuw draaien, dan diagnose-rdp.sh en de AWS "Try Me!"-tab controleren.~~ ✅✅ WERKT: alle 3 queue-bindings up:true met bindSuccessCount:1, RDP-aws leverde 21 berichten daadwerkelijk af, zichtbaar in AWS "Try Me!" op de juiste topic. Azure/STACKIT staan klaar, nog ongetest.</w:t>
       </w:r>
     </w:p>
     <w:p>
@@ -2047,7 +2043,7 @@
         <w:spacing w:after="80"/>
       </w:pPr>
       <w:r>
-        <w:t xml:space="preserve">~~configure-rdp-export.sh opnieuw draaien, dan diagnose-rdp.sh en de AWS "Try Me!"-tab controleren.~~ ✅✅ WERKT: alle 3 queue-bindings up:true met bindSuccessCount:1, RDP-aws leverde 21 berichten daadwerkelijk af, zichtbaar in AWS "Try Me!" op de juiste topic. Azure/STACKIT staan klaar, nog ongetest.</w:t>
+        <w:t xml:space="preserve">~~Eerste end-to-end testronde: publiceren met stm/python/sdkperf en per cloud-broker controleren dat het bericht op dezelfde topic aankomt, en nergens anders.~~ ✅ Afgerond, 3/3: stm-public -&gt; AWS. python-eu-nonpersonal -&gt; Azure (20 berichten, na een zsh-commentaar-instructiefout hersteld). sdkperf-pii -&gt; STACKIT (20 berichten, na een SDKPERF_BIN PATH-fix). Elke app landde toen uitsluitend op zijn eigen doelbroker (zie volgende bullet voor de daaropvolgende versterking).</w:t>
       </w:r>
     </w:p>
     <w:p>
@@ -2060,7 +2056,7 @@
         <w:spacing w:after="80"/>
       </w:pPr>
       <w:r>
-        <w:t xml:space="preserve">~~Eerste end-to-end testronde: publiceren met stm/python/sdkperf en per cloud-broker controleren dat het bericht op dezelfde topic aankomt, en nergens anders.~~ ✅ Afgerond, 3/3: stm-public -&gt; AWS. python-eu-nonpersonal -&gt; Azure (20 berichten, na een zsh-commentaar-instructiefout hersteld). sdkperf-pii -&gt; STACKIT (20 berichten, na een SDKPERF_BIN PATH-fix). Elke app landde toen uitsluitend op zijn eigen doelbroker (zie volgende bullet voor de daaropvolgende versterking).</w:t>
+        <w:t xml:space="preserve">~~Documentatie synchroniseren met de code, README herschrijven, doorlopend-draaien-script toevoegen.~~ ✅ -- 3 documenten met stale RDP/bridge-verwijzingen gecorrigeerd; README.md is nu de volledige stap-voor-stap-handleiding vanaf nul (uitgaand van bestaande Solace Cloud-services/credentials); nieuw local-broker/scripts/run-demo-loop.sh laat de 3 demo-apps doorlopend draaien voor stand/booth-gebruik.</w:t>
       </w:r>
     </w:p>
     <w:p>
@@ -2073,7 +2069,7 @@
         <w:spacing w:after="80"/>
       </w:pPr>
       <w:r>
-        <w:t xml:space="preserve">~~Documentatie synchroniseren met de code, README herschrijven, doorlopend-draaien-script toevoegen.~~ ✅ -- 3 documenten met stale RDP/bridge-verwijzingen gecorrigeerd; README.md is nu de volledige stap-voor-stap-handleiding vanaf nul (uitgaand van bestaande Solace Cloud-services/credentials); nieuw local-broker/scripts/run-demo-loop.sh laat de 3 demo-apps doorlopend draaien voor stand/booth-gebruik.</w:t>
+        <w:t xml:space="preserve">~~Elke demo-app alle 3 dataklassen laten publiceren i.p.v. maar één per app, zodat de topic -- niet de tool -- de bestemming bepaalt.~~ ✅ -- alle 3 scripts herschreven met per-klasse credential/topic/payload en per-klasse foutisolatie (één falende klasse stopt de andere twee niet), --class-vlag toegevoegd om optioneel tot één klasse te beperken, gedeelde demo-apps/sample-payloads/ geïntroduceerd, alle documentatie (READMEs, docs/demo-apps.md, docs/topologie.md + topology/topologie.mmd, root-README.md) bijgewerkt.</w:t>
       </w:r>
     </w:p>
     <w:p>
@@ -2086,7 +2082,7 @@
         <w:spacing w:after="80"/>
       </w:pPr>
       <w:r>
-        <w:t xml:space="preserve">~~Elke demo-app alle 3 dataklassen laten publiceren i.p.v. maar één per app, zodat de topic -- niet de tool -- de bestemming bepaalt.~~ ✅ -- alle 3 scripts herschreven met per-klasse credential/topic/payload en per-klasse foutisolatie (één falende klasse stopt de andere twee niet), --class-vlag toegevoegd om optioneel tot één klasse te beperken, gedeelde demo-apps/sample-payloads/ geïntroduceerd, alle documentatie (READMEs, docs/demo-apps.md, docs/topologie.md + topology/topologie.mmd, root-README.md) bijgewerkt.</w:t>
+        <w:t xml:space="preserve">~~Variatie uitbreiden (type/market voor publiek, postcodeArea/customerId voor eu-ops/eu-pii) en TODO.md/AGENTS.md/SKILLS.md toevoegen zodat de sessie gesloten en later hervat kan worden.~~ ✅ -- zie PLAN.md sectie 13, punten 36-39. TODO.md bevat nu de actuele, geprioriteerde actielijst (in plaats van deze paragraaf); AGENTS.md en SKILLS.md geven een AI-coding-agent of nieuwe bijdrager de architectuurconventies resp. herbruikbare recepten.</w:t>
       </w:r>
     </w:p>
     <w:p>
@@ -2099,7 +2095,7 @@
         <w:spacing w:after="80"/>
       </w:pPr>
       <w:r>
-        <w:t xml:space="preserve">~~Variatie uitbreiden (type/market voor publiek, postcodeArea/customerId voor eu-ops/eu-pii) en TODO.md/AGENTS.md/SKILLS.md toevoegen zodat de sessie gesloten en later hervat kan worden.~~ ✅ -- zie PLAN.md sectie 13, punten 36-39. TODO.md bevat nu de actuele, geprioriteerde actielijst (in plaats van deze paragraaf); AGENTS.md en SKILLS.md geven een AI-coding-agent of nieuwe bijdrager de architectuurconventies resp. herbruikbare recepten.</w:t>
+        <w:t xml:space="preserve">~~De 3 cloud-broker-services opnieuw aanmaken via de nieuwe Terraform-opzet (cloud-setup/terraform/, Developer 100-tier, 2 org's) en local-broker/.env bijwerken.~~ ✅ -- alle 3 services Running (02/10/2026); STACKIT bleek een eigen, echte dedicated datacenter te hebben (geen GCP-interim nodig). local-broker/.env staat op de nieuwe hostnames/VPN-naam/SEMP-credentials (zie PLAN.md sectie 13, punt 42).</w:t>
       </w:r>
     </w:p>
     <w:p>
@@ -2112,20 +2108,7 @@
         <w:spacing w:after="80"/>
       </w:pPr>
       <w:r>
-        <w:t xml:space="preserve">De 3 cloud-broker-services zijn verwijderd; Terraform-opzet (cloud-setup/terraform/) toegevoegd om ze opnieuw aan te maken (Developer 100-tier, 2 org's). Moet nog door Emil zelf gedraaid worden (netwerktoegang vanuit de sessie is geblokkeerd) -- zie PLAN.md sectie 13, punt 40 en TODO.md, "Blokkerend". Dit blokkeert alle andere testwerk totdat het is gedaan.</w:t>
-      </w:r>
-    </w:p>
-    <w:p>
-      <w:pPr>
-        <w:pStyle w:val="ListParagraph"/>
-        <w:numPr>
-          <w:ilvl w:val="0"/>
-          <w:numId w:val="2"/>
-        </w:numPr>
-        <w:spacing w:after="80"/>
-      </w:pPr>
-      <w:r>
-        <w:t xml:space="preserve">Daarna: local-broker/.env bijwerken, de SEMP-configuratiescripts opnieuw draaien, testplan herhalen, en pas dan draaiboek + fallback-opname voorbereiden (zie TODO.md).</w:t>
+        <w:t xml:space="preserve">Nu: configure-remote-bridge-users.sh, configure-local-broker.sh en configure-rdp-export.sh opnieuw draaien tegen de nieuwe services (de oude bridge-user/ACL's bestonden alleen op de verwijderde services), daarna testplan (sectie 12) herhalen, en pas dan draaiboek + fallback-opname voorbereiden (zie TODO.md).</w:t>
       </w:r>
     </w:p>
     <w:sectPr>

</xml_diff>

<commit_message>
Volledige keten end-to-end herbevestigd tegen de 3 nieuw aangemaakte services
Na de RDP-restConsumer-fix (vorige commit) configure-rdp-export.sh
opnieuw gedraaid en stm-public/publish-public.sh herhaald: berichten
komen weer aan op alle 3 cloud-brokers (AWS/Azure/STACKIT), elk
uitsluitend op zijn eigen topic-subtree. PLAN.md punt 44, TODO.md en de
Word-samenvatting bijgewerkt; de blokkerende sectie in TODO.md is
hiermee volledig afgevinkt.

Co-Authored-By: Claude Sonnet 5 <noreply@anthropic.com>
Claude-Session: https://claude.ai/code/session_01LyLzg69DjEjtAeYz9FrHW3
</commit_message>
<xml_diff>
--- a/docs/Plan-van-aanpak-DADD2026-Enewable.docx
+++ b/docs/Plan-van-aanpak-DADD2026-Enewable.docx
@@ -76,7 +76,7 @@
           <w:sz w:val="20"/>
           <w:szCs w:val="20"/>
         </w:rPr>
-        <w:t xml:space="preserve">Status (02/10/2026): de 3 cloud-broker-services hierboven zijn opnieuw aangemaakt -- nu als "Developer 100"-tier (niet-HA) verdeeld over twee Solace Cloud-organisaties (AWS+Azure in de ene, STACKIT in de andere), via een nieuwe Terraform-opzet (cloud-setup/terraform/, Solace's eigen beta-provider) i.p.v. de eerdere Enterprise-250-HA-klasse in één org. STACKIT bleek daarbij een eigen, echte dedicated datacenter te hebben -- de eerder voorziene GCP-interim-stand-in is niet nodig gebleken. local-broker/.env is bijgewerkt met de nieuwe hostnames/VPN-naam/SEMP-credentials; de configuratiescripts (bridge-user, lokale broker, RDP-export) moeten nog opnieuw draaien vóór een hernieuwde end-to-end-bevestiging. Zie PLAN.md sectie 13, punt 42 en TODO.md voor de volledige details.</w:t>
+        <w:t xml:space="preserve">Status (02/10/2026): de 3 cloud-broker-services hierboven zijn opnieuw aangemaakt -- nu als "Developer 100"-tier (niet-HA) verdeeld over twee Solace Cloud-organisaties (AWS+Azure in de ene, STACKIT in de andere), via een nieuwe Terraform-opzet (cloud-setup/terraform/, Solace's eigen beta-provider) i.p.v. de eerdere Enterprise-250-HA-klasse in één org. STACKIT bleek daarbij een eigen, echte dedicated datacenter te hebben -- de eerder voorziene GCP-interim-stand-in is niet nodig gebleken. De volledige keten (nieuwe services, local-broker/.env, bridge-users, lokale broker, RDP-export) is end-to-end herbevestigd: onderweg bleek configure-rdp-export.sh een echte bug te hebben (de RDP bleef op een rerun op de OUDE cloud-hosts/credentials staan, want nooit gepatcht) -- gevonden en gefixt. Zie PLAN.md sectie 13, punten 42-44 en TODO.md voor de volledige details.</w:t>
       </w:r>
     </w:p>
     <w:p>
@@ -1583,7 +1583,7 @@
                 <w:b w:val="false"/>
                 <w:bCs w:val="false"/>
               </w:rPr>
-              <w:t xml:space="preserve">✅ Eerder volledig end-to-end bevestigd, maar tegen de inmiddels verwijderde cloud-services -- local-broker/.env staat al op de nieuwe services; configure-remote-bridge-users.sh/configure-local-broker.sh/configure-rdp-export.sh moeten opnieuw draaien vóór hernieuwde bevestiging</w:t>
+              <w:t xml:space="preserve">✅✅ Opnieuw volledig end-to-end bevestigd tegen de nieuwe services (02/10/2026) -- onderweg een echte bug gevonden en gefixt (RDP restConsumer bleef op oude cloud-hosts/credentials staan, zie PLAN.md sectie 13 punt 43)</w:t>
             </w:r>
           </w:p>
         </w:tc>
@@ -1603,7 +1603,7 @@
                 <w:b w:val="false"/>
                 <w:bCs w:val="false"/>
               </w:rPr>
-              <w:t xml:space="preserve">Opnieuw te bevestigen tegen nieuwe services</w:t>
+              <w:t xml:space="preserve">Afgerond, 02/10/2026</w:t>
             </w:r>
           </w:p>
         </w:tc>
@@ -1665,7 +1665,7 @@
                 <w:b w:val="false"/>
                 <w:bCs w:val="false"/>
               </w:rPr>
-              <w:t xml:space="preserve">✅ Eerder 3/3 bevestigd (stm-public, python-eu-nonpersonal, sdkperf-pii, elk alle 3 dataklassen per run) -- zelfde kanttekening als fase 4, herhalen tegen de nieuwe services</w:t>
+              <w:t xml:space="preserve">✅ stm-public herbevestigd op alle 3 cloud-brokers (02/10/2026); python-eu-nonpersonal en sdkperf-pii nog los te herbevestigen tegen de nieuwe services</w:t>
             </w:r>
           </w:p>
         </w:tc>
@@ -1685,7 +1685,7 @@
                 <w:b w:val="false"/>
                 <w:bCs w:val="false"/>
               </w:rPr>
-              <w:t xml:space="preserve">Herhalen na fase 4, en nogmaals vóór DADD zelf</w:t>
+              <w:t xml:space="preserve">Grotendeels afgerond, 2 apps nog te herhalen</w:t>
             </w:r>
           </w:p>
         </w:tc>
@@ -2108,7 +2108,20 @@
         <w:spacing w:after="80"/>
       </w:pPr>
       <w:r>
-        <w:t xml:space="preserve">Nu: configure-remote-bridge-users.sh, configure-local-broker.sh en configure-rdp-export.sh opnieuw draaien tegen de nieuwe services (de oude bridge-user/ACL's bestonden alleen op de verwijderde services), daarna testplan (sectie 12) herhalen, en pas dan draaiboek + fallback-opname voorbereiden (zie TODO.md).</w:t>
+        <w:t xml:space="preserve">~~configure-remote-bridge-users.sh, configure-local-broker.sh en configure-rdp-export.sh opnieuw draaien tegen de nieuwe services, dan publish-test.~~ ✅ -- onderweg een echte bug gevonden en gefixt: de RDP's restConsumer werd op een rerun nooit bijgewerkt en bleef op de oude cloud-hosts/credentials staan (PLAN.md sectie 13, punt 43). Na de fix: stm-public bevestigd op alle 3 cloud-brokers, elk op zijn eigen topic (punt 44).</w:t>
+      </w:r>
+    </w:p>
+    <w:p>
+      <w:pPr>
+        <w:pStyle w:val="ListParagraph"/>
+        <w:numPr>
+          <w:ilvl w:val="0"/>
+          <w:numId w:val="2"/>
+        </w:numPr>
+        <w:spacing w:after="80"/>
+      </w:pPr>
+      <w:r>
+        <w:t xml:space="preserve">Nu: python-eu-nonpersonal en sdkperf-pii ook nog los herbevestigen tegen de nieuwe services, dan de negative-ACL-test (testplan-punt 5), en vlak vóór DADD zelf de volledige testronde nogmaals herhalen (zie TODO.md).</w:t>
       </w:r>
     </w:p>
     <w:sectPr>

</xml_diff>

<commit_message>
run-demo-loop.sh --once volledig geslaagd: alle 3 demo-apps, alle 3 klassen
Na de mktemp-fix: stm-public, python-eu-nonpersonal en sdkperf-pii alle
drie 1 ok / 0 mislukt in één doorlopende cyclus. Fase 5 (demo-apps
valideren) is daarmee opnieuw bevestigd tegen de in Terraform
aangemaakte services. PLAN.md punt 46 en de Word-samenvatting
bijgewerkt.

Co-Authored-By: Claude Sonnet 5 <noreply@anthropic.com>
Claude-Session: https://claude.ai/code/session_01LyLzg69DjEjtAeYz9FrHW3
</commit_message>
<xml_diff>
--- a/docs/Plan-van-aanpak-DADD2026-Enewable.docx
+++ b/docs/Plan-van-aanpak-DADD2026-Enewable.docx
@@ -1665,7 +1665,7 @@
                 <w:b w:val="false"/>
                 <w:bCs w:val="false"/>
               </w:rPr>
-              <w:t xml:space="preserve">✅ stm-public herbevestigd op alle 3 cloud-brokers (02/10/2026); python-eu-nonpersonal en sdkperf-pii nog los te herbevestigen tegen de nieuwe services</w:t>
+              <w:t xml:space="preserve">✅✅ Alle 3 demo-apps herbevestigd tegen de nieuwe services via run-demo-loop.sh --once (02/10/2026) -- onderweg nog een bug gevonden en gefixt (macOS mktemp randomiseerde niet, zie PLAN.md sectie 13 punt 45)</w:t>
             </w:r>
           </w:p>
         </w:tc>
@@ -1685,7 +1685,7 @@
                 <w:b w:val="false"/>
                 <w:bCs w:val="false"/>
               </w:rPr>
-              <w:t xml:space="preserve">Grotendeels afgerond, 2 apps nog te herhalen</w:t>
+              <w:t xml:space="preserve">Afgerond, 02/10/2026</w:t>
             </w:r>
           </w:p>
         </w:tc>
@@ -2121,7 +2121,20 @@
         <w:spacing w:after="80"/>
       </w:pPr>
       <w:r>
-        <w:t xml:space="preserve">Nu: python-eu-nonpersonal en sdkperf-pii ook nog los herbevestigen tegen de nieuwe services, dan de negative-ACL-test (testplan-punt 5), en vlak vóór DADD zelf de volledige testronde nogmaals herhalen (zie TODO.md).</w:t>
+        <w:t xml:space="preserve">~~python-eu-nonpersonal en sdkperf-pii ook nog herbevestigen tegen de nieuwe services.~~ ✅ -- via run-demo-loop.sh --once draaien nu alle 3 demo-apps weer foutloos (onderweg een macOS-specifieke mktemp-bug gevonden en gefixt, PLAN.md sectie 13 punt 45-46).</w:t>
+      </w:r>
+    </w:p>
+    <w:p>
+      <w:pPr>
+        <w:pStyle w:val="ListParagraph"/>
+        <w:numPr>
+          <w:ilvl w:val="0"/>
+          <w:numId w:val="2"/>
+        </w:numPr>
+        <w:spacing w:after="80"/>
+      </w:pPr>
+      <w:r>
+        <w:t xml:space="preserve">Nu: de negative-ACL-test (testplan-punt 5, nog niet gedaan), en vlak vóór DADD zelf de volledige testronde nogmaals herhalen (zie TODO.md).</w:t>
       </w:r>
     </w:p>
     <w:sectPr>

</xml_diff>

<commit_message>
Volledige testronde (fase 5) stap voor stap herhaald en bevestigd
Broker Manager-check, alle 3 demo-apps elk uitsluitend op hun eigen
doelbroker (AWS/Azure/STACKIT), en een reguliere containerrestart
gevolgd door een foutloze, idempotente herconfiguratie zonder
handmatige opschoning -- hiermee is de keten uit punt 42-46 nu ook na
een restart bevestigd. Observatie, geen bug: de eerste STACKIT-
berichten deden er ruim een minuut over (lokale queue bleef leeg),
wat past bij een eenmalige cold start van de REST-verbinding naar de
net aangemaakte service. TODO.md's testronde-bullet afgevinkt, Word-
samenvatting bijgewerkt.

Co-Authored-By: Claude Sonnet 5 <noreply@anthropic.com>
Claude-Session: https://claude.ai/code/session_01LyLzg69DjEjtAeYz9FrHW3
</commit_message>
<xml_diff>
--- a/docs/Plan-van-aanpak-DADD2026-Enewable.docx
+++ b/docs/Plan-van-aanpak-DADD2026-Enewable.docx
@@ -76,7 +76,7 @@
           <w:sz w:val="20"/>
           <w:szCs w:val="20"/>
         </w:rPr>
-        <w:t xml:space="preserve">Status (02/10/2026): de 3 cloud-broker-services hierboven zijn opnieuw aangemaakt -- nu als "Developer 100"-tier (niet-HA) verdeeld over twee Solace Cloud-organisaties (AWS+Azure in de ene, STACKIT in de andere), via een nieuwe Terraform-opzet (cloud-setup/terraform/, Solace's eigen beta-provider) i.p.v. de eerdere Enterprise-250-HA-klasse in één org. STACKIT bleek daarbij een eigen, echte dedicated datacenter te hebben -- de eerder voorziene GCP-interim-stand-in is niet nodig gebleken. De volledige keten (nieuwe services, local-broker/.env, bridge-users, lokale broker, RDP-export) is end-to-end herbevestigd: onderweg bleek configure-rdp-export.sh een echte bug te hebben (de RDP bleef op een rerun op de OUDE cloud-hosts/credentials staan, want nooit gepatcht) -- gevonden en gefixt. Zie PLAN.md sectie 13, punten 42-44 en TODO.md voor de volledige details.</w:t>
+        <w:t xml:space="preserve">Status (02/10/2026): de 3 cloud-broker-services hierboven zijn opnieuw aangemaakt -- nu als "Developer 100"-tier (niet-HA) verdeeld over twee Solace Cloud-organisaties (AWS+Azure in de ene, STACKIT in de andere), via een nieuwe Terraform-opzet (cloud-setup/terraform/, Solace's eigen beta-provider) i.p.v. de eerdere Enterprise-250-HA-klasse in één org. STACKIT bleek daarbij een eigen, echte dedicated datacenter te hebben -- de eerder voorziene GCP-interim-stand-in is niet nodig gebleken. De volledige keten (nieuwe services, local-broker/.env, bridge-users, lokale broker, RDP-export) is end-to-end herbevestigd: onderweg bleek configure-rdp-export.sh een echte bug te hebben (de RDP bleef op een rerun op de OUDE cloud-hosts/credentials staan, want nooit gepatcht) -- gevonden en gefixt. Daarna is de volledige testronde nogmaals stap voor stap herhaald en door Emil bevestigd: Broker Manager-check, alle 3 demo-apps elk uitsluitend op hun eigen doelbroker, en een reguliere containerrestart gevolgd door een foutloze, idempotente herconfiguratie (geen duplicaten, geen handmatige opschoning nodig). Enige bijzonderheid: de allereerste STACKIT-berichten deden er ruim een minuut over om aan te komen (terwijl de lokale queue leeg bleef) -- een eenmalige "cold start" van de REST-verbinding naar de zojuist aangemaakte service, geen configuratiefout. Zie PLAN.md sectie 13, punten 42-48 en TODO.md voor de volledige details.</w:t>
       </w:r>
     </w:p>
     <w:p>
@@ -1665,7 +1665,7 @@
                 <w:b w:val="false"/>
                 <w:bCs w:val="false"/>
               </w:rPr>
-              <w:t xml:space="preserve">✅✅ Alle 3 demo-apps herbevestigd tegen de nieuwe services via run-demo-loop.sh --once (02/10/2026) -- onderweg nog een bug gevonden en gefixt (macOS mktemp randomiseerde niet, zie PLAN.md sectie 13 punt 45)</w:t>
+              <w:t xml:space="preserve">✅✅ Alle 3 demo-apps herbevestigd tegen de nieuwe services via run-demo-loop.sh --once (02/10/2026) -- onderweg nog een bug gevonden en gefixt (macOS mktemp randomiseerde niet, zie PLAN.md sectie 13 punt 45). Daarna de volledige testronde nogmaals stap voor stap herhaald en bevestigd, inclusief idempotentie na een containerrestart (PLAN.md sectie 13 punt 48)</w:t>
             </w:r>
           </w:p>
         </w:tc>
@@ -2134,7 +2134,20 @@
         <w:spacing w:after="80"/>
       </w:pPr>
       <w:r>
-        <w:t xml:space="preserve">Nu: de negative-ACL-test (testplan-punt 5, nog niet gedaan), en vlak vóór DADD zelf de volledige testronde nogmaals herhalen (zie TODO.md).</w:t>
+        <w:t xml:space="preserve">~~De volledige testronde (fase 5, sectie 12 punten 1-4 en 6) nogmaals stap voor stap herhalen, met bevestiging na elke stap.~~ ✅ -- Broker Manager-check, alle 3 demo-apps elk uitsluitend op hun eigen doelbroker, en een reguliere containerrestart gevolgd door een foutloze, idempotente herconfiguratie (zie PLAN.md sectie 13, punt 48). De negative-ACL-test (testplan-punt 5) en het meten van de koude-starttijd (testplan-punt 7) zijn op Emils expliciete verzoek naar "Kan na DADD" resp. van de lijst gehaald.</w:t>
+      </w:r>
+    </w:p>
+    <w:p>
+      <w:pPr>
+        <w:pStyle w:val="ListParagraph"/>
+        <w:numPr>
+          <w:ilvl w:val="0"/>
+          <w:numId w:val="2"/>
+        </w:numPr>
+        <w:spacing w:after="80"/>
+      </w:pPr>
+      <w:r>
+        <w:t xml:space="preserve">Nu: een visueel aantrekkelijke presentatie in Solace-huisstijl die het hele proces van scratch tot draaiende omgeving beeldend beschrijft, met architectuurdiagrammen en workflow-voorbeelden.</w:t>
       </w:r>
     </w:p>
     <w:sectPr>

</xml_diff>